<commit_message>
Pakai Claude (Anthropic API) di setiap tahap, aturan sebagai cadangan
- sikuli.ai: Claude membaca PDF langsung (termasuk scan) untuk seksi,
  satuan, dan angka akun; memetakan label Excel yang tidak dikenali;
  menulis catatan baris bukan MATCH serta kesimpulan dan rekomendasi
  per entitas. Structured outputs, streaming, fallback server-side.
- Angka dari AI dicek ulang ke teks halaman (kolom verifikasi);
  konversi angka dan status komparasi tetap deterministik
- Tanpa ANTHROPIC_API_KEY atau bila panggilan gagal, otomatis memakai
  jalur aturan per dokumen
- Output baru: sheet Kesimpulan, kolom sumber_catatan, verifikasi_pdf,
  sumber_ekstraksi, verifikasi
- Workflow analisis membaca secret ANTHROPIC_API_KEY; config ai:
- README dan Instruksi_SIKULI.docx diperbarui

Co-Authored-By: Claude Opus 5.5 <noreply@anthropic.com>
Claude-Session: https://claude.ai/code/session_0179Fwjd3gAu5tSteq7aYjMy
</commit_message>
<xml_diff>
--- a/docs/Instruksi_SIKULI.docx
+++ b/docs/Instruksi_SIKULI.docx
@@ -249,7 +249,17 @@
         <w:t xml:space="preserve">GitHub Actions</w:t>
       </w:r>
       <w:r>
-        <w:t xml:space="preserve">; tidak ada aplikasi yang perlu dipasang atau dibuka.</w:t>
+        <w:t xml:space="preserve">; tidak ada aplikasi yang perlu dipasang atau dibuka. </w:t>
+      </w:r>
+      <w:r>
+        <w:rPr>
+          <w:b/>
+          <w:bCs/>
+        </w:rPr>
+        <w:t xml:space="preserve">Claude (Anthropic API)</w:t>
+      </w:r>
+      <w:r>
+        <w:t xml:space="preserve"> dipakai di hampir setiap tahap; jika API key tidak tersedia, sistem memakai jalur aturan.</w:t>
       </w:r>
     </w:p>
     <w:p>
@@ -719,6 +729,717 @@
     </w:p>
     <w:p>
       <w:pPr>
+        <w:pStyle w:val="Heading2"/>
+      </w:pPr>
+      <w:r>
+        <w:t xml:space="preserve">Peran AI di setiap tahap</w:t>
+      </w:r>
+    </w:p>
+    <w:tbl>
+      <w:tblPr>
+        <w:tblW w:type="dxa" w:w="9026"/>
+        <w:tblBorders>
+          <w:top w:val="single" w:color="auto" w:sz="4"/>
+          <w:left w:val="single" w:color="auto" w:sz="4"/>
+          <w:bottom w:val="single" w:color="auto" w:sz="4"/>
+          <w:right w:val="single" w:color="auto" w:sz="4"/>
+          <w:insideH w:val="single" w:color="auto" w:sz="4"/>
+          <w:insideV w:val="single" w:color="auto" w:sz="4"/>
+        </w:tblBorders>
+      </w:tblPr>
+      <w:tblGrid>
+        <w:gridCol w:w="2347"/>
+        <w:gridCol w:w="4152"/>
+        <w:gridCol w:w="2527"/>
+      </w:tblGrid>
+      <w:tr>
+        <w:trPr>
+          <w:tblHeader/>
+        </w:trPr>
+        <w:tc>
+          <w:tcPr>
+            <w:tcW w:type="dxa" w:w="2347"/>
+            <w:tcBorders>
+              <w:top w:val="single" w:color="C9D1DC" w:sz="4"/>
+              <w:left w:val="single" w:color="C9D1DC" w:sz="4"/>
+              <w:bottom w:val="single" w:color="C9D1DC" w:sz="4"/>
+              <w:right w:val="single" w:color="C9D1DC" w:sz="4"/>
+            </w:tcBorders>
+            <w:shd w:fill="DCE9F2" w:color="auto" w:val="clear"/>
+            <w:tcMar>
+              <w:top w:type="dxa" w:w="60"/>
+              <w:left w:type="dxa" w:w="100"/>
+              <w:bottom w:type="dxa" w:w="60"/>
+              <w:right w:type="dxa" w:w="100"/>
+            </w:tcMar>
+          </w:tcPr>
+          <w:p>
+            <w:r>
+              <w:rPr>
+                <w:b/>
+                <w:bCs/>
+                <w:sz w:val="19"/>
+                <w:szCs w:val="19"/>
+              </w:rPr>
+              <w:t xml:space="preserve">Tahap</w:t>
+            </w:r>
+          </w:p>
+        </w:tc>
+        <w:tc>
+          <w:tcPr>
+            <w:tcW w:type="dxa" w:w="4152"/>
+            <w:tcBorders>
+              <w:top w:val="single" w:color="C9D1DC" w:sz="4"/>
+              <w:left w:val="single" w:color="C9D1DC" w:sz="4"/>
+              <w:bottom w:val="single" w:color="C9D1DC" w:sz="4"/>
+              <w:right w:val="single" w:color="C9D1DC" w:sz="4"/>
+            </w:tcBorders>
+            <w:shd w:fill="DCE9F2" w:color="auto" w:val="clear"/>
+            <w:tcMar>
+              <w:top w:type="dxa" w:w="60"/>
+              <w:left w:type="dxa" w:w="100"/>
+              <w:bottom w:type="dxa" w:w="60"/>
+              <w:right w:type="dxa" w:w="100"/>
+            </w:tcMar>
+          </w:tcPr>
+          <w:p>
+            <w:r>
+              <w:rPr>
+                <w:b/>
+                <w:bCs/>
+                <w:sz w:val="19"/>
+                <w:szCs w:val="19"/>
+              </w:rPr>
+              <w:t xml:space="preserve">Dengan AI</w:t>
+            </w:r>
+          </w:p>
+        </w:tc>
+        <w:tc>
+          <w:tcPr>
+            <w:tcW w:type="dxa" w:w="2527"/>
+            <w:tcBorders>
+              <w:top w:val="single" w:color="C9D1DC" w:sz="4"/>
+              <w:left w:val="single" w:color="C9D1DC" w:sz="4"/>
+              <w:bottom w:val="single" w:color="C9D1DC" w:sz="4"/>
+              <w:right w:val="single" w:color="C9D1DC" w:sz="4"/>
+            </w:tcBorders>
+            <w:shd w:fill="DCE9F2" w:color="auto" w:val="clear"/>
+            <w:tcMar>
+              <w:top w:type="dxa" w:w="60"/>
+              <w:left w:type="dxa" w:w="100"/>
+              <w:bottom w:type="dxa" w:w="60"/>
+              <w:right w:type="dxa" w:w="100"/>
+            </w:tcMar>
+          </w:tcPr>
+          <w:p>
+            <w:r>
+              <w:rPr>
+                <w:b/>
+                <w:bCs/>
+                <w:sz w:val="19"/>
+                <w:szCs w:val="19"/>
+              </w:rPr>
+              <w:t xml:space="preserve">Cadangan tanpa AI</w:t>
+            </w:r>
+          </w:p>
+        </w:tc>
+      </w:tr>
+      <w:tr>
+        <w:tc>
+          <w:tcPr>
+            <w:tcW w:type="dxa" w:w="2347"/>
+            <w:tcBorders>
+              <w:top w:val="single" w:color="C9D1DC" w:sz="4"/>
+              <w:left w:val="single" w:color="C9D1DC" w:sz="4"/>
+              <w:bottom w:val="single" w:color="C9D1DC" w:sz="4"/>
+              <w:right w:val="single" w:color="C9D1DC" w:sz="4"/>
+            </w:tcBorders>
+            <w:tcMar>
+              <w:top w:type="dxa" w:w="60"/>
+              <w:left w:type="dxa" w:w="100"/>
+              <w:bottom w:type="dxa" w:w="60"/>
+              <w:right w:type="dxa" w:w="100"/>
+            </w:tcMar>
+          </w:tcPr>
+          <w:p>
+            <w:r>
+              <w:rPr>
+                <w:b w:val="false"/>
+                <w:bCs w:val="false"/>
+                <w:sz w:val="19"/>
+                <w:szCs w:val="19"/>
+              </w:rPr>
+              <w:t xml:space="preserve">Parsing PDF, seksi, satuan, angka akun</w:t>
+            </w:r>
+          </w:p>
+        </w:tc>
+        <w:tc>
+          <w:tcPr>
+            <w:tcW w:type="dxa" w:w="4152"/>
+            <w:tcBorders>
+              <w:top w:val="single" w:color="C9D1DC" w:sz="4"/>
+              <w:left w:val="single" w:color="C9D1DC" w:sz="4"/>
+              <w:bottom w:val="single" w:color="C9D1DC" w:sz="4"/>
+              <w:right w:val="single" w:color="C9D1DC" w:sz="4"/>
+            </w:tcBorders>
+            <w:tcMar>
+              <w:top w:type="dxa" w:w="60"/>
+              <w:left w:type="dxa" w:w="100"/>
+              <w:bottom w:type="dxa" w:w="60"/>
+              <w:right w:type="dxa" w:w="100"/>
+            </w:tcMar>
+          </w:tcPr>
+          <w:p>
+            <w:r>
+              <w:rPr>
+                <w:b w:val="false"/>
+                <w:bCs w:val="false"/>
+                <w:sz w:val="19"/>
+                <w:szCs w:val="19"/>
+              </w:rPr>
+              <w:t xml:space="preserve">Claude membaca PDF langsung (termasuk PDF hasil scan), menentukan halaman dan satuan tiap seksi, lalu menyalin angka akun sesuai </w:t>
+            </w:r>
+            <w:r>
+              <w:rPr>
+                <w:rFonts w:ascii="Courier New" w:cs="Courier New" w:eastAsia="Courier New" w:hAnsi="Courier New"/>
+                <w:color w:val="1D2433"/>
+                <w:sz w:val="19"/>
+                <w:szCs w:val="19"/>
+              </w:rPr>
+              <w:t xml:space="preserve">rules_akun.csv</w:t>
+            </w:r>
+            <w:r>
+              <w:rPr>
+                <w:b w:val="false"/>
+                <w:bCs w:val="false"/>
+                <w:sz w:val="19"/>
+                <w:szCs w:val="19"/>
+              </w:rPr>
+              <w:t xml:space="preserve">.</w:t>
+            </w:r>
+          </w:p>
+        </w:tc>
+        <w:tc>
+          <w:tcPr>
+            <w:tcW w:type="dxa" w:w="2527"/>
+            <w:tcBorders>
+              <w:top w:val="single" w:color="C9D1DC" w:sz="4"/>
+              <w:left w:val="single" w:color="C9D1DC" w:sz="4"/>
+              <w:bottom w:val="single" w:color="C9D1DC" w:sz="4"/>
+              <w:right w:val="single" w:color="C9D1DC" w:sz="4"/>
+            </w:tcBorders>
+            <w:tcMar>
+              <w:top w:type="dxa" w:w="60"/>
+              <w:left w:type="dxa" w:w="100"/>
+              <w:bottom w:type="dxa" w:w="60"/>
+              <w:right w:type="dxa" w:w="100"/>
+            </w:tcMar>
+          </w:tcPr>
+          <w:p>
+            <w:r>
+              <w:rPr>
+                <w:b w:val="false"/>
+                <w:bCs w:val="false"/>
+                <w:sz w:val="19"/>
+                <w:szCs w:val="19"/>
+              </w:rPr>
+              <w:t xml:space="preserve">pdfplumber + pola </w:t>
+            </w:r>
+            <w:r>
+              <w:rPr>
+                <w:rFonts w:ascii="Courier New" w:cs="Courier New" w:eastAsia="Courier New" w:hAnsi="Courier New"/>
+                <w:color w:val="1D2433"/>
+                <w:sz w:val="19"/>
+                <w:szCs w:val="19"/>
+              </w:rPr>
+              <w:t xml:space="preserve">mapping_seksi</w:t>
+            </w:r>
+            <w:r>
+              <w:rPr>
+                <w:b w:val="false"/>
+                <w:bCs w:val="false"/>
+                <w:sz w:val="19"/>
+                <w:szCs w:val="19"/>
+              </w:rPr>
+              <w:t xml:space="preserve"> + pencocokan label.</w:t>
+            </w:r>
+          </w:p>
+        </w:tc>
+      </w:tr>
+      <w:tr>
+        <w:tc>
+          <w:tcPr>
+            <w:tcW w:type="dxa" w:w="2347"/>
+            <w:tcBorders>
+              <w:top w:val="single" w:color="C9D1DC" w:sz="4"/>
+              <w:left w:val="single" w:color="C9D1DC" w:sz="4"/>
+              <w:bottom w:val="single" w:color="C9D1DC" w:sz="4"/>
+              <w:right w:val="single" w:color="C9D1DC" w:sz="4"/>
+            </w:tcBorders>
+            <w:tcMar>
+              <w:top w:type="dxa" w:w="60"/>
+              <w:left w:type="dxa" w:w="100"/>
+              <w:bottom w:type="dxa" w:w="60"/>
+              <w:right w:type="dxa" w:w="100"/>
+            </w:tcMar>
+          </w:tcPr>
+          <w:p>
+            <w:r>
+              <w:rPr>
+                <w:b w:val="false"/>
+                <w:bCs w:val="false"/>
+                <w:sz w:val="19"/>
+                <w:szCs w:val="19"/>
+              </w:rPr>
+              <w:t xml:space="preserve">Verifikasi angka PDF</w:t>
+            </w:r>
+          </w:p>
+        </w:tc>
+        <w:tc>
+          <w:tcPr>
+            <w:tcW w:type="dxa" w:w="4152"/>
+            <w:tcBorders>
+              <w:top w:val="single" w:color="C9D1DC" w:sz="4"/>
+              <w:left w:val="single" w:color="C9D1DC" w:sz="4"/>
+              <w:bottom w:val="single" w:color="C9D1DC" w:sz="4"/>
+              <w:right w:val="single" w:color="C9D1DC" w:sz="4"/>
+            </w:tcBorders>
+            <w:tcMar>
+              <w:top w:type="dxa" w:w="60"/>
+              <w:left w:type="dxa" w:w="100"/>
+              <w:bottom w:type="dxa" w:w="60"/>
+              <w:right w:type="dxa" w:w="100"/>
+            </w:tcMar>
+          </w:tcPr>
+          <w:p>
+            <w:r>
+              <w:rPr>
+                <w:b w:val="false"/>
+                <w:bCs w:val="false"/>
+                <w:sz w:val="19"/>
+                <w:szCs w:val="19"/>
+              </w:rPr>
+              <w:t xml:space="preserve">Setiap angka dari AI dicek ulang ke teks halaman rujukan (kolom </w:t>
+            </w:r>
+            <w:r>
+              <w:rPr>
+                <w:rFonts w:ascii="Courier New" w:cs="Courier New" w:eastAsia="Courier New" w:hAnsi="Courier New"/>
+                <w:color w:val="1D2433"/>
+                <w:sz w:val="19"/>
+                <w:szCs w:val="19"/>
+              </w:rPr>
+              <w:t xml:space="preserve">verifikasi</w:t>
+            </w:r>
+            <w:r>
+              <w:rPr>
+                <w:b w:val="false"/>
+                <w:bCs w:val="false"/>
+                <w:sz w:val="19"/>
+                <w:szCs w:val="19"/>
+              </w:rPr>
+              <w:t xml:space="preserve">).</w:t>
+            </w:r>
+          </w:p>
+        </w:tc>
+        <w:tc>
+          <w:tcPr>
+            <w:tcW w:type="dxa" w:w="2527"/>
+            <w:tcBorders>
+              <w:top w:val="single" w:color="C9D1DC" w:sz="4"/>
+              <w:left w:val="single" w:color="C9D1DC" w:sz="4"/>
+              <w:bottom w:val="single" w:color="C9D1DC" w:sz="4"/>
+              <w:right w:val="single" w:color="C9D1DC" w:sz="4"/>
+            </w:tcBorders>
+            <w:tcMar>
+              <w:top w:type="dxa" w:w="60"/>
+              <w:left w:type="dxa" w:w="100"/>
+              <w:bottom w:type="dxa" w:w="60"/>
+              <w:right w:type="dxa" w:w="100"/>
+            </w:tcMar>
+          </w:tcPr>
+          <w:p>
+            <w:r>
+              <w:rPr>
+                <w:b w:val="false"/>
+                <w:bCs w:val="false"/>
+                <w:sz w:val="19"/>
+                <w:szCs w:val="19"/>
+              </w:rPr>
+              <w:t xml:space="preserve">-</w:t>
+            </w:r>
+          </w:p>
+        </w:tc>
+      </w:tr>
+      <w:tr>
+        <w:tc>
+          <w:tcPr>
+            <w:tcW w:type="dxa" w:w="2347"/>
+            <w:tcBorders>
+              <w:top w:val="single" w:color="C9D1DC" w:sz="4"/>
+              <w:left w:val="single" w:color="C9D1DC" w:sz="4"/>
+              <w:bottom w:val="single" w:color="C9D1DC" w:sz="4"/>
+              <w:right w:val="single" w:color="C9D1DC" w:sz="4"/>
+            </w:tcBorders>
+            <w:tcMar>
+              <w:top w:type="dxa" w:w="60"/>
+              <w:left w:type="dxa" w:w="100"/>
+              <w:bottom w:type="dxa" w:w="60"/>
+              <w:right w:type="dxa" w:w="100"/>
+            </w:tcMar>
+          </w:tcPr>
+          <w:p>
+            <w:r>
+              <w:rPr>
+                <w:b w:val="false"/>
+                <w:bCs w:val="false"/>
+                <w:sz w:val="19"/>
+                <w:szCs w:val="19"/>
+              </w:rPr>
+              <w:t xml:space="preserve">Pemetaan label Excel</w:t>
+            </w:r>
+          </w:p>
+        </w:tc>
+        <w:tc>
+          <w:tcPr>
+            <w:tcW w:type="dxa" w:w="4152"/>
+            <w:tcBorders>
+              <w:top w:val="single" w:color="C9D1DC" w:sz="4"/>
+              <w:left w:val="single" w:color="C9D1DC" w:sz="4"/>
+              <w:bottom w:val="single" w:color="C9D1DC" w:sz="4"/>
+              <w:right w:val="single" w:color="C9D1DC" w:sz="4"/>
+            </w:tcBorders>
+            <w:tcMar>
+              <w:top w:type="dxa" w:w="60"/>
+              <w:left w:type="dxa" w:w="100"/>
+              <w:bottom w:type="dxa" w:w="60"/>
+              <w:right w:type="dxa" w:w="100"/>
+            </w:tcMar>
+          </w:tcPr>
+          <w:p>
+            <w:r>
+              <w:rPr>
+                <w:b w:val="false"/>
+                <w:bCs w:val="false"/>
+                <w:sz w:val="19"/>
+                <w:szCs w:val="19"/>
+              </w:rPr>
+              <w:t xml:space="preserve">Label yang tidak dikenali rules dipetakan Claude (</w:t>
+            </w:r>
+            <w:r>
+              <w:rPr>
+                <w:rFonts w:ascii="Courier New" w:cs="Courier New" w:eastAsia="Courier New" w:hAnsi="Courier New"/>
+                <w:color w:val="1D2433"/>
+                <w:sz w:val="19"/>
+                <w:szCs w:val="19"/>
+              </w:rPr>
+              <w:t xml:space="preserve">cara_pemetaan = ai</w:t>
+            </w:r>
+            <w:r>
+              <w:rPr>
+                <w:b w:val="false"/>
+                <w:bCs w:val="false"/>
+                <w:sz w:val="19"/>
+                <w:szCs w:val="19"/>
+              </w:rPr>
+              <w:t xml:space="preserve">).</w:t>
+            </w:r>
+          </w:p>
+        </w:tc>
+        <w:tc>
+          <w:tcPr>
+            <w:tcW w:type="dxa" w:w="2527"/>
+            <w:tcBorders>
+              <w:top w:val="single" w:color="C9D1DC" w:sz="4"/>
+              <w:left w:val="single" w:color="C9D1DC" w:sz="4"/>
+              <w:bottom w:val="single" w:color="C9D1DC" w:sz="4"/>
+              <w:right w:val="single" w:color="C9D1DC" w:sz="4"/>
+            </w:tcBorders>
+            <w:tcMar>
+              <w:top w:type="dxa" w:w="60"/>
+              <w:left w:type="dxa" w:w="100"/>
+              <w:bottom w:type="dxa" w:w="60"/>
+              <w:right w:type="dxa" w:w="100"/>
+            </w:tcMar>
+          </w:tcPr>
+          <w:p>
+            <w:r>
+              <w:rPr>
+                <w:b w:val="false"/>
+                <w:bCs w:val="false"/>
+                <w:sz w:val="19"/>
+                <w:szCs w:val="19"/>
+              </w:rPr>
+              <w:t xml:space="preserve">Label dibiarkan belum terpetakan.</w:t>
+            </w:r>
+          </w:p>
+        </w:tc>
+      </w:tr>
+      <w:tr>
+        <w:tc>
+          <w:tcPr>
+            <w:tcW w:type="dxa" w:w="2347"/>
+            <w:tcBorders>
+              <w:top w:val="single" w:color="C9D1DC" w:sz="4"/>
+              <w:left w:val="single" w:color="C9D1DC" w:sz="4"/>
+              <w:bottom w:val="single" w:color="C9D1DC" w:sz="4"/>
+              <w:right w:val="single" w:color="C9D1DC" w:sz="4"/>
+            </w:tcBorders>
+            <w:tcMar>
+              <w:top w:type="dxa" w:w="60"/>
+              <w:left w:type="dxa" w:w="100"/>
+              <w:bottom w:type="dxa" w:w="60"/>
+              <w:right w:type="dxa" w:w="100"/>
+            </w:tcMar>
+          </w:tcPr>
+          <w:p>
+            <w:r>
+              <w:rPr>
+                <w:b w:val="false"/>
+                <w:bCs w:val="false"/>
+                <w:sz w:val="19"/>
+                <w:szCs w:val="19"/>
+              </w:rPr>
+              <w:t xml:space="preserve">Komparasi dan status</w:t>
+            </w:r>
+          </w:p>
+        </w:tc>
+        <w:tc>
+          <w:tcPr>
+            <w:tcW w:type="dxa" w:w="4152"/>
+            <w:tcBorders>
+              <w:top w:val="single" w:color="C9D1DC" w:sz="4"/>
+              <w:left w:val="single" w:color="C9D1DC" w:sz="4"/>
+              <w:bottom w:val="single" w:color="C9D1DC" w:sz="4"/>
+              <w:right w:val="single" w:color="C9D1DC" w:sz="4"/>
+            </w:tcBorders>
+            <w:tcMar>
+              <w:top w:type="dxa" w:w="60"/>
+              <w:left w:type="dxa" w:w="100"/>
+              <w:bottom w:type="dxa" w:w="60"/>
+              <w:right w:type="dxa" w:w="100"/>
+            </w:tcMar>
+          </w:tcPr>
+          <w:p>
+            <w:r>
+              <w:rPr>
+                <w:b w:val="false"/>
+                <w:bCs w:val="false"/>
+                <w:sz w:val="19"/>
+                <w:szCs w:val="19"/>
+              </w:rPr>
+              <w:t xml:space="preserve">Deterministik (kode), tanpa AI.</w:t>
+            </w:r>
+          </w:p>
+        </w:tc>
+        <w:tc>
+          <w:tcPr>
+            <w:tcW w:type="dxa" w:w="2527"/>
+            <w:tcBorders>
+              <w:top w:val="single" w:color="C9D1DC" w:sz="4"/>
+              <w:left w:val="single" w:color="C9D1DC" w:sz="4"/>
+              <w:bottom w:val="single" w:color="C9D1DC" w:sz="4"/>
+              <w:right w:val="single" w:color="C9D1DC" w:sz="4"/>
+            </w:tcBorders>
+            <w:tcMar>
+              <w:top w:type="dxa" w:w="60"/>
+              <w:left w:type="dxa" w:w="100"/>
+              <w:bottom w:type="dxa" w:w="60"/>
+              <w:right w:type="dxa" w:w="100"/>
+            </w:tcMar>
+          </w:tcPr>
+          <w:p>
+            <w:r>
+              <w:rPr>
+                <w:b w:val="false"/>
+                <w:bCs w:val="false"/>
+                <w:sz w:val="19"/>
+                <w:szCs w:val="19"/>
+              </w:rPr>
+              <w:t xml:space="preserve">Sama.</w:t>
+            </w:r>
+          </w:p>
+        </w:tc>
+      </w:tr>
+      <w:tr>
+        <w:tc>
+          <w:tcPr>
+            <w:tcW w:type="dxa" w:w="2347"/>
+            <w:tcBorders>
+              <w:top w:val="single" w:color="C9D1DC" w:sz="4"/>
+              <w:left w:val="single" w:color="C9D1DC" w:sz="4"/>
+              <w:bottom w:val="single" w:color="C9D1DC" w:sz="4"/>
+              <w:right w:val="single" w:color="C9D1DC" w:sz="4"/>
+            </w:tcBorders>
+            <w:tcMar>
+              <w:top w:type="dxa" w:w="60"/>
+              <w:left w:type="dxa" w:w="100"/>
+              <w:bottom w:type="dxa" w:w="60"/>
+              <w:right w:type="dxa" w:w="100"/>
+            </w:tcMar>
+          </w:tcPr>
+          <w:p>
+            <w:r>
+              <w:rPr>
+                <w:b w:val="false"/>
+                <w:bCs w:val="false"/>
+                <w:sz w:val="19"/>
+                <w:szCs w:val="19"/>
+              </w:rPr>
+              <w:t xml:space="preserve">Catatan per baris</w:t>
+            </w:r>
+          </w:p>
+        </w:tc>
+        <w:tc>
+          <w:tcPr>
+            <w:tcW w:type="dxa" w:w="4152"/>
+            <w:tcBorders>
+              <w:top w:val="single" w:color="C9D1DC" w:sz="4"/>
+              <w:left w:val="single" w:color="C9D1DC" w:sz="4"/>
+              <w:bottom w:val="single" w:color="C9D1DC" w:sz="4"/>
+              <w:right w:val="single" w:color="C9D1DC" w:sz="4"/>
+            </w:tcBorders>
+            <w:tcMar>
+              <w:top w:type="dxa" w:w="60"/>
+              <w:left w:type="dxa" w:w="100"/>
+              <w:bottom w:type="dxa" w:w="60"/>
+              <w:right w:type="dxa" w:w="100"/>
+            </w:tcMar>
+          </w:tcPr>
+          <w:p>
+            <w:r>
+              <w:rPr>
+                <w:b w:val="false"/>
+                <w:bCs w:val="false"/>
+                <w:sz w:val="19"/>
+                <w:szCs w:val="19"/>
+              </w:rPr>
+              <w:t xml:space="preserve">Catatan analis untuk baris bukan MATCH.</w:t>
+            </w:r>
+          </w:p>
+        </w:tc>
+        <w:tc>
+          <w:tcPr>
+            <w:tcW w:type="dxa" w:w="2527"/>
+            <w:tcBorders>
+              <w:top w:val="single" w:color="C9D1DC" w:sz="4"/>
+              <w:left w:val="single" w:color="C9D1DC" w:sz="4"/>
+              <w:bottom w:val="single" w:color="C9D1DC" w:sz="4"/>
+              <w:right w:val="single" w:color="C9D1DC" w:sz="4"/>
+            </w:tcBorders>
+            <w:tcMar>
+              <w:top w:type="dxa" w:w="60"/>
+              <w:left w:type="dxa" w:w="100"/>
+              <w:bottom w:type="dxa" w:w="60"/>
+              <w:right w:type="dxa" w:w="100"/>
+            </w:tcMar>
+          </w:tcPr>
+          <w:p>
+            <w:r>
+              <w:rPr>
+                <w:b w:val="false"/>
+                <w:bCs w:val="false"/>
+                <w:sz w:val="19"/>
+                <w:szCs w:val="19"/>
+              </w:rPr>
+              <w:t xml:space="preserve">Catatan template.</w:t>
+            </w:r>
+          </w:p>
+        </w:tc>
+      </w:tr>
+      <w:tr>
+        <w:tc>
+          <w:tcPr>
+            <w:tcW w:type="dxa" w:w="2347"/>
+            <w:tcBorders>
+              <w:top w:val="single" w:color="C9D1DC" w:sz="4"/>
+              <w:left w:val="single" w:color="C9D1DC" w:sz="4"/>
+              <w:bottom w:val="single" w:color="C9D1DC" w:sz="4"/>
+              <w:right w:val="single" w:color="C9D1DC" w:sz="4"/>
+            </w:tcBorders>
+            <w:tcMar>
+              <w:top w:type="dxa" w:w="60"/>
+              <w:left w:type="dxa" w:w="100"/>
+              <w:bottom w:type="dxa" w:w="60"/>
+              <w:right w:type="dxa" w:w="100"/>
+            </w:tcMar>
+          </w:tcPr>
+          <w:p>
+            <w:r>
+              <w:rPr>
+                <w:b w:val="false"/>
+                <w:bCs w:val="false"/>
+                <w:sz w:val="19"/>
+                <w:szCs w:val="19"/>
+              </w:rPr>
+              <w:t xml:space="preserve">Kesimpulan dan rekomendasi</w:t>
+            </w:r>
+          </w:p>
+        </w:tc>
+        <w:tc>
+          <w:tcPr>
+            <w:tcW w:type="dxa" w:w="4152"/>
+            <w:tcBorders>
+              <w:top w:val="single" w:color="C9D1DC" w:sz="4"/>
+              <w:left w:val="single" w:color="C9D1DC" w:sz="4"/>
+              <w:bottom w:val="single" w:color="C9D1DC" w:sz="4"/>
+              <w:right w:val="single" w:color="C9D1DC" w:sz="4"/>
+            </w:tcBorders>
+            <w:tcMar>
+              <w:top w:type="dxa" w:w="60"/>
+              <w:left w:type="dxa" w:w="100"/>
+              <w:bottom w:type="dxa" w:w="60"/>
+              <w:right w:type="dxa" w:w="100"/>
+            </w:tcMar>
+          </w:tcPr>
+          <w:p>
+            <w:r>
+              <w:rPr>
+                <w:b w:val="false"/>
+                <w:bCs w:val="false"/>
+                <w:sz w:val="19"/>
+                <w:szCs w:val="19"/>
+              </w:rPr>
+              <w:t xml:space="preserve">Per entitas, sheet Kesimpulan.</w:t>
+            </w:r>
+          </w:p>
+        </w:tc>
+        <w:tc>
+          <w:tcPr>
+            <w:tcW w:type="dxa" w:w="2527"/>
+            <w:tcBorders>
+              <w:top w:val="single" w:color="C9D1DC" w:sz="4"/>
+              <w:left w:val="single" w:color="C9D1DC" w:sz="4"/>
+              <w:bottom w:val="single" w:color="C9D1DC" w:sz="4"/>
+              <w:right w:val="single" w:color="C9D1DC" w:sz="4"/>
+            </w:tcBorders>
+            <w:tcMar>
+              <w:top w:type="dxa" w:w="60"/>
+              <w:left w:type="dxa" w:w="100"/>
+              <w:bottom w:type="dxa" w:w="60"/>
+              <w:right w:type="dxa" w:w="100"/>
+            </w:tcMar>
+          </w:tcPr>
+          <w:p>
+            <w:r>
+              <w:rPr>
+                <w:b w:val="false"/>
+                <w:bCs w:val="false"/>
+                <w:sz w:val="19"/>
+                <w:szCs w:val="19"/>
+              </w:rPr>
+              <w:t xml:space="preserve">Tidak dibuat.</w:t>
+            </w:r>
+          </w:p>
+        </w:tc>
+      </w:tr>
+    </w:tbl>
+    <w:p>
+      <w:pPr>
+        <w:spacing w:after="120"/>
+      </w:pPr>
+    </w:p>
+    <w:p>
+      <w:pPr>
         <w:pStyle w:val="Heading1"/>
         <w:pageBreakBefore/>
       </w:pPr>
@@ -1366,77 +2087,10 @@
     </w:p>
     <w:p>
       <w:pPr>
-        <w:pStyle w:val="Heading1"/>
-        <w:pageBreakBefore/>
-      </w:pPr>
-      <w:r>
-        <w:t xml:space="preserve">3. Cara menjalankan analisis</w:t>
-      </w:r>
-    </w:p>
-    <w:p>
-      <w:pPr>
         <w:pStyle w:val="Heading2"/>
       </w:pPr>
       <w:r>
-        <w:t xml:space="preserve">3.1 Mengisi rules</w:t>
-      </w:r>
-    </w:p>
-    <w:p>
-      <w:pPr>
-        <w:spacing w:after="120"/>
-      </w:pPr>
-      <w:r>
-        <w:t xml:space="preserve">Isi atau perbarui file di folder </w:t>
-      </w:r>
-      <w:r>
-        <w:rPr>
-          <w:rFonts w:ascii="Courier New" w:cs="Courier New" w:eastAsia="Courier New" w:hAnsi="Courier New"/>
-          <w:color w:val="1D2433"/>
-          <w:sz w:val="20"/>
-          <w:szCs w:val="20"/>
-        </w:rPr>
-        <w:t xml:space="preserve">rules/</w:t>
-      </w:r>
-      <w:r>
-        <w:t xml:space="preserve"> (penjelasan kolom di Bab 5). Cara mengubah lewat web GitHub: buka file → ikon pensil (</w:t>
-      </w:r>
-      <w:r>
-        <w:rPr>
-          <w:b/>
-          <w:bCs/>
-        </w:rPr>
-        <w:t xml:space="preserve">Edit</w:t>
-      </w:r>
-      <w:r>
-        <w:t xml:space="preserve">) → ubah → </w:t>
-      </w:r>
-      <w:r>
-        <w:rPr>
-          <w:b/>
-          <w:bCs/>
-        </w:rPr>
-        <w:t xml:space="preserve">Commit changes</w:t>
-      </w:r>
-      <w:r>
-        <w:t xml:space="preserve">. Bisa juga disusun di Excel lalu disimpan sebagai </w:t>
-      </w:r>
-      <w:r>
-        <w:rPr>
-          <w:b/>
-          <w:bCs/>
-        </w:rPr>
-        <w:t xml:space="preserve">CSV UTF-8</w:t>
-      </w:r>
-      <w:r>
-        <w:t xml:space="preserve"> dan diunggah menggantikan file lama.</w:t>
-      </w:r>
-    </w:p>
-    <w:p>
-      <w:pPr>
-        <w:pStyle w:val="Heading2"/>
-      </w:pPr>
-      <w:r>
-        <w:t xml:space="preserve">3.2 Mengunggah file LK</w:t>
+        <w:t xml:space="preserve">2.3 Mengaktifkan AI (Claude)</w:t>
       </w:r>
     </w:p>
     <w:p>
@@ -1449,19 +2103,17 @@
         <w:spacing w:after="80"/>
       </w:pPr>
       <w:r>
-        <w:t xml:space="preserve">Buka folder </w:t>
+        <w:t xml:space="preserve">Buat API key di </w:t>
       </w:r>
       <w:r>
         <w:rPr>
-          <w:rFonts w:ascii="Courier New" w:cs="Courier New" w:eastAsia="Courier New" w:hAnsi="Courier New"/>
-          <w:color w:val="1D2433"/>
-          <w:sz w:val="20"/>
-          <w:szCs w:val="20"/>
+          <w:b/>
+          <w:bCs/>
         </w:rPr>
-        <w:t xml:space="preserve">input/pdf/</w:t>
-      </w:r>
-      <w:r>
-        <w:t xml:space="preserve"> di GitHub.</w:t>
+        <w:t xml:space="preserve">console.anthropic.com</w:t>
+      </w:r>
+      <w:r>
+        <w:t xml:space="preserve"> (menu API Keys).</w:t>
       </w:r>
     </w:p>
     <w:p>
@@ -1474,24 +2126,14 @@
         <w:spacing w:after="80"/>
       </w:pPr>
       <w:r>
-        <w:t xml:space="preserve">Klik </w:t>
+        <w:t xml:space="preserve">Di GitHub: </w:t>
       </w:r>
       <w:r>
         <w:rPr>
           <w:b/>
           <w:bCs/>
         </w:rPr>
-        <w:t xml:space="preserve">Add file → Upload files</w:t>
-      </w:r>
-      <w:r>
-        <w:t xml:space="preserve">, pilih file PDF, lalu </w:t>
-      </w:r>
-      <w:r>
-        <w:rPr>
-          <w:b/>
-          <w:bCs/>
-        </w:rPr>
-        <w:t xml:space="preserve">Commit changes</w:t>
+        <w:t xml:space="preserve">Settings → Secrets and variables → Actions → New repository secret</w:t>
       </w:r>
       <w:r>
         <w:t xml:space="preserve">.</w:t>
@@ -1507,7 +2149,7 @@
         <w:spacing w:after="80"/>
       </w:pPr>
       <w:r>
-        <w:t xml:space="preserve">Ulangi untuk Excel di folder </w:t>
+        <w:t xml:space="preserve">Isi nama </w:t>
       </w:r>
       <w:r>
         <w:rPr>
@@ -1516,10 +2158,57 @@
           <w:sz w:val="20"/>
           <w:szCs w:val="20"/>
         </w:rPr>
-        <w:t xml:space="preserve">input/excel/</w:t>
+        <w:t xml:space="preserve">ANTHROPIC_API_KEY</w:t>
+      </w:r>
+      <w:r>
+        <w:t xml:space="preserve"> dan tempelkan key, lalu </w:t>
+      </w:r>
+      <w:r>
+        <w:rPr>
+          <w:b/>
+          <w:bCs/>
+        </w:rPr>
+        <w:t xml:space="preserve">Add secret</w:t>
       </w:r>
       <w:r>
         <w:t xml:space="preserve">.</w:t>
+      </w:r>
+    </w:p>
+    <w:p>
+      <w:pPr>
+        <w:pStyle w:val="ListParagraph"/>
+        <w:numPr>
+          <w:ilvl w:val="0"/>
+          <w:numId w:val="4"/>
+        </w:numPr>
+        <w:spacing w:after="80"/>
+      </w:pPr>
+      <w:r>
+        <w:t xml:space="preserve">Atur model dan tahap yang memakai AI di bagian </w:t>
+      </w:r>
+      <w:r>
+        <w:rPr>
+          <w:rFonts w:ascii="Courier New" w:cs="Courier New" w:eastAsia="Courier New" w:hAnsi="Courier New"/>
+          <w:color w:val="1D2433"/>
+          <w:sz w:val="20"/>
+          <w:szCs w:val="20"/>
+        </w:rPr>
+        <w:t xml:space="preserve">ai:</w:t>
+      </w:r>
+      <w:r>
+        <w:t xml:space="preserve"> pada </w:t>
+      </w:r>
+      <w:r>
+        <w:rPr>
+          <w:rFonts w:ascii="Courier New" w:cs="Courier New" w:eastAsia="Courier New" w:hAnsi="Courier New"/>
+          <w:color w:val="1D2433"/>
+          <w:sz w:val="20"/>
+          <w:szCs w:val="20"/>
+        </w:rPr>
+        <w:t xml:space="preserve">config/pipeline.yaml</w:t>
+      </w:r>
+      <w:r>
+        <w:t xml:space="preserve"> (lihat Bab 6).</w:t>
       </w:r>
     </w:p>
     <w:p>
@@ -1532,17 +2221,32 @@
         <w:ind w:left="200" w:right="200"/>
       </w:pPr>
       <w:r>
-        <w:t xml:space="preserve">Nama file PDF dan Excel harus memakai </w:t>
-      </w:r>
-      <w:r>
-        <w:rPr>
-          <w:b/>
-          <w:bCs/>
-        </w:rPr>
-        <w:t xml:space="preserve">awalan dan tahun yang sama</w:t>
-      </w:r>
-      <w:r>
-        <w:t xml:space="preserve">, misalnya </w:t>
+        <w:t xml:space="preserve">Dengan AI aktif, isi PDF dan label Excel dikirim ke Anthropic API. Pastikan sesuai kebijakan data instansi sebelum mengunggah LK asli. Mode yang dipakai (AI atau aturan) tertulis di baris pertama ringkasan run.</w:t>
+      </w:r>
+    </w:p>
+    <w:p>
+      <w:pPr>
+        <w:pStyle w:val="Heading1"/>
+        <w:pageBreakBefore/>
+      </w:pPr>
+      <w:r>
+        <w:t xml:space="preserve">3. Cara menjalankan analisis</w:t>
+      </w:r>
+    </w:p>
+    <w:p>
+      <w:pPr>
+        <w:pStyle w:val="Heading2"/>
+      </w:pPr>
+      <w:r>
+        <w:t xml:space="preserve">3.1 Mengisi rules</w:t>
+      </w:r>
+    </w:p>
+    <w:p>
+      <w:pPr>
+        <w:spacing w:after="120"/>
+      </w:pPr>
+      <w:r>
+        <w:t xml:space="preserve">Isi atau perbarui file di folder </w:t>
       </w:r>
       <w:r>
         <w:rPr>
@@ -1551,22 +2255,40 @@
           <w:sz w:val="20"/>
           <w:szCs w:val="20"/>
         </w:rPr>
-        <w:t xml:space="preserve">AAAA_LK_2024.pdf</w:t>
-      </w:r>
-      <w:r>
-        <w:t xml:space="preserve"> dan </w:t>
+        <w:t xml:space="preserve">rules/</w:t>
+      </w:r>
+      <w:r>
+        <w:t xml:space="preserve"> (penjelasan kolom di Bab 5). Cara mengubah lewat web GitHub: buka file → ikon pensil (</w:t>
       </w:r>
       <w:r>
         <w:rPr>
-          <w:rFonts w:ascii="Courier New" w:cs="Courier New" w:eastAsia="Courier New" w:hAnsi="Courier New"/>
-          <w:color w:val="1D2433"/>
-          <w:sz w:val="20"/>
-          <w:szCs w:val="20"/>
+          <w:b/>
+          <w:bCs/>
         </w:rPr>
-        <w:t xml:space="preserve">AAAA_2024.xlsx</w:t>
-      </w:r>
-      <w:r>
-        <w:t xml:space="preserve">. Dari situ sistem tahu keduanya pasangan.</w:t>
+        <w:t xml:space="preserve">Edit</w:t>
+      </w:r>
+      <w:r>
+        <w:t xml:space="preserve">) → ubah → </w:t>
+      </w:r>
+      <w:r>
+        <w:rPr>
+          <w:b/>
+          <w:bCs/>
+        </w:rPr>
+        <w:t xml:space="preserve">Commit changes</w:t>
+      </w:r>
+      <w:r>
+        <w:t xml:space="preserve">. Bisa juga disusun di Excel lalu disimpan sebagai </w:t>
+      </w:r>
+      <w:r>
+        <w:rPr>
+          <w:b/>
+          <w:bCs/>
+        </w:rPr>
+        <w:t xml:space="preserve">CSV UTF-8</w:t>
+      </w:r>
+      <w:r>
+        <w:t xml:space="preserve"> dan diunggah menggantikan file lama.</w:t>
       </w:r>
     </w:p>
     <w:p>
@@ -1574,7 +2296,7 @@
         <w:pStyle w:val="Heading2"/>
       </w:pPr>
       <w:r>
-        <w:t xml:space="preserve">3.3 Menjalankan workflow</w:t>
+        <w:t xml:space="preserve">3.2 Mengunggah file LK</w:t>
       </w:r>
     </w:p>
     <w:p>
@@ -1584,17 +2306,10 @@
           <w:ilvl w:val="0"/>
           <w:numId w:val="5"/>
         </w:numPr>
-        <w:spacing w:after="60"/>
+        <w:spacing w:after="80"/>
       </w:pPr>
       <w:r>
-        <w:rPr>
-          <w:b/>
-          <w:bCs/>
-        </w:rPr>
-        <w:t xml:space="preserve">Otomatis</w:t>
-      </w:r>
-      <w:r>
-        <w:t xml:space="preserve">: workflow </w:t>
+        <w:t xml:space="preserve">Buka folder </w:t>
       </w:r>
       <w:r>
         <w:rPr>
@@ -1603,46 +2318,10 @@
           <w:sz w:val="20"/>
           <w:szCs w:val="20"/>
         </w:rPr>
-        <w:t xml:space="preserve">analisis</w:t>
-      </w:r>
-      <w:r>
-        <w:t xml:space="preserve"> berjalan setiap ada perubahan di folder </w:t>
-      </w:r>
-      <w:r>
-        <w:rPr>
-          <w:rFonts w:ascii="Courier New" w:cs="Courier New" w:eastAsia="Courier New" w:hAnsi="Courier New"/>
-          <w:color w:val="1D2433"/>
-          <w:sz w:val="20"/>
-          <w:szCs w:val="20"/>
-        </w:rPr>
-        <w:t xml:space="preserve">input/</w:t>
-      </w:r>
-      <w:r>
-        <w:t xml:space="preserve">, </w:t>
-      </w:r>
-      <w:r>
-        <w:rPr>
-          <w:rFonts w:ascii="Courier New" w:cs="Courier New" w:eastAsia="Courier New" w:hAnsi="Courier New"/>
-          <w:color w:val="1D2433"/>
-          <w:sz w:val="20"/>
-          <w:szCs w:val="20"/>
-        </w:rPr>
-        <w:t xml:space="preserve">rules/</w:t>
-      </w:r>
-      <w:r>
-        <w:t xml:space="preserve">, atau </w:t>
-      </w:r>
-      <w:r>
-        <w:rPr>
-          <w:rFonts w:ascii="Courier New" w:cs="Courier New" w:eastAsia="Courier New" w:hAnsi="Courier New"/>
-          <w:color w:val="1D2433"/>
-          <w:sz w:val="20"/>
-          <w:szCs w:val="20"/>
-        </w:rPr>
-        <w:t xml:space="preserve">config/</w:t>
-      </w:r>
-      <w:r>
-        <w:t xml:space="preserve">.</w:t>
+        <w:t xml:space="preserve">input/pdf/</w:t>
+      </w:r>
+      <w:r>
+        <w:t xml:space="preserve"> di GitHub.</w:t>
       </w:r>
     </w:p>
     <w:p>
@@ -1652,65 +2331,102 @@
           <w:ilvl w:val="0"/>
           <w:numId w:val="5"/>
         </w:numPr>
-        <w:spacing w:after="60"/>
+        <w:spacing w:after="80"/>
       </w:pPr>
+      <w:r>
+        <w:t xml:space="preserve">Klik </w:t>
+      </w:r>
       <w:r>
         <w:rPr>
           <w:b/>
           <w:bCs/>
         </w:rPr>
-        <w:t xml:space="preserve">Manual</w:t>
-      </w:r>
-      <w:r>
-        <w:t xml:space="preserve">: tab </w:t>
+        <w:t xml:space="preserve">Add file → Upload files</w:t>
+      </w:r>
+      <w:r>
+        <w:t xml:space="preserve">, pilih file PDF, lalu </w:t>
       </w:r>
       <w:r>
         <w:rPr>
           <w:b/>
           <w:bCs/>
         </w:rPr>
-        <w:t xml:space="preserve">Actions</w:t>
-      </w:r>
-      <w:r>
-        <w:t xml:space="preserve"> → pilih </w:t>
+        <w:t xml:space="preserve">Commit changes</w:t>
+      </w:r>
+      <w:r>
+        <w:t xml:space="preserve">.</w:t>
+      </w:r>
+    </w:p>
+    <w:p>
+      <w:pPr>
+        <w:pStyle w:val="ListParagraph"/>
+        <w:numPr>
+          <w:ilvl w:val="0"/>
+          <w:numId w:val="5"/>
+        </w:numPr>
+        <w:spacing w:after="80"/>
+      </w:pPr>
+      <w:r>
+        <w:t xml:space="preserve">Ulangi untuk Excel di folder </w:t>
+      </w:r>
+      <w:r>
+        <w:rPr>
+          <w:rFonts w:ascii="Courier New" w:cs="Courier New" w:eastAsia="Courier New" w:hAnsi="Courier New"/>
+          <w:color w:val="1D2433"/>
+          <w:sz w:val="20"/>
+          <w:szCs w:val="20"/>
+        </w:rPr>
+        <w:t xml:space="preserve">input/excel/</w:t>
+      </w:r>
+      <w:r>
+        <w:t xml:space="preserve">.</w:t>
+      </w:r>
+    </w:p>
+    <w:p>
+      <w:pPr>
+        <w:pBdr>
+          <w:left w:val="single" w:color="E0A100" w:sz="18" w:space="8"/>
+        </w:pBdr>
+        <w:shd w:fill="FFF4D6" w:color="auto" w:val="clear"/>
+        <w:spacing w:after="160" w:before="120"/>
+        <w:ind w:left="200" w:right="200"/>
+      </w:pPr>
+      <w:r>
+        <w:t xml:space="preserve">Nama file PDF dan Excel harus memakai </w:t>
       </w:r>
       <w:r>
         <w:rPr>
           <w:b/>
           <w:bCs/>
         </w:rPr>
-        <w:t xml:space="preserve">analisis</w:t>
-      </w:r>
-      <w:r>
-        <w:t xml:space="preserve"> di kiri → tombol </w:t>
+        <w:t xml:space="preserve">awalan dan tahun yang sama</w:t>
+      </w:r>
+      <w:r>
+        <w:t xml:space="preserve">, misalnya </w:t>
       </w:r>
       <w:r>
         <w:rPr>
-          <w:b/>
-          <w:bCs/>
+          <w:rFonts w:ascii="Courier New" w:cs="Courier New" w:eastAsia="Courier New" w:hAnsi="Courier New"/>
+          <w:color w:val="1D2433"/>
+          <w:sz w:val="20"/>
+          <w:szCs w:val="20"/>
         </w:rPr>
-        <w:t xml:space="preserve">Run workflow</w:t>
-      </w:r>
-      <w:r>
-        <w:t xml:space="preserve"> → </w:t>
+        <w:t xml:space="preserve">AAAA_LK_2024.pdf</w:t>
+      </w:r>
+      <w:r>
+        <w:t xml:space="preserve"> dan </w:t>
       </w:r>
       <w:r>
         <w:rPr>
-          <w:b/>
-          <w:bCs/>
+          <w:rFonts w:ascii="Courier New" w:cs="Courier New" w:eastAsia="Courier New" w:hAnsi="Courier New"/>
+          <w:color w:val="1D2433"/>
+          <w:sz w:val="20"/>
+          <w:szCs w:val="20"/>
         </w:rPr>
-        <w:t xml:space="preserve">Run workflow</w:t>
-      </w:r>
-      <w:r>
-        <w:t xml:space="preserve">.</w:t>
-      </w:r>
-    </w:p>
-    <w:p>
-      <w:pPr>
-        <w:spacing w:after="120"/>
-      </w:pPr>
-      <w:r>
-        <w:t xml:space="preserve">Proses biasanya selesai dalam 1–3 menit, tergantung jumlah dan ukuran file.</w:t>
+        <w:t xml:space="preserve">AAAA_2024.xlsx</w:t>
+      </w:r>
+      <w:r>
+        <w:t xml:space="preserve">. Dari situ sistem tahu keduanya pasangan.</w:t>
       </w:r>
     </w:p>
     <w:p>
@@ -1718,7 +2434,7 @@
         <w:pStyle w:val="Heading2"/>
       </w:pPr>
       <w:r>
-        <w:t xml:space="preserve">3.4 Melihat dan mengunduh hasil</w:t>
+        <w:t xml:space="preserve">3.3 Menjalankan workflow</w:t>
       </w:r>
     </w:p>
     <w:p>
@@ -1728,20 +2444,65 @@
           <w:ilvl w:val="0"/>
           <w:numId w:val="6"/>
         </w:numPr>
-        <w:spacing w:after="80"/>
+        <w:spacing w:after="60"/>
       </w:pPr>
-      <w:r>
-        <w:t xml:space="preserve">Buka tab </w:t>
-      </w:r>
       <w:r>
         <w:rPr>
           <w:b/>
           <w:bCs/>
         </w:rPr>
-        <w:t xml:space="preserve">Actions</w:t>
-      </w:r>
-      <w:r>
-        <w:t xml:space="preserve">, klik run teratas (tanda centang hijau = berhasil).</w:t>
+        <w:t xml:space="preserve">Otomatis</w:t>
+      </w:r>
+      <w:r>
+        <w:t xml:space="preserve">: workflow </w:t>
+      </w:r>
+      <w:r>
+        <w:rPr>
+          <w:rFonts w:ascii="Courier New" w:cs="Courier New" w:eastAsia="Courier New" w:hAnsi="Courier New"/>
+          <w:color w:val="1D2433"/>
+          <w:sz w:val="20"/>
+          <w:szCs w:val="20"/>
+        </w:rPr>
+        <w:t xml:space="preserve">analisis</w:t>
+      </w:r>
+      <w:r>
+        <w:t xml:space="preserve"> berjalan setiap ada perubahan di folder </w:t>
+      </w:r>
+      <w:r>
+        <w:rPr>
+          <w:rFonts w:ascii="Courier New" w:cs="Courier New" w:eastAsia="Courier New" w:hAnsi="Courier New"/>
+          <w:color w:val="1D2433"/>
+          <w:sz w:val="20"/>
+          <w:szCs w:val="20"/>
+        </w:rPr>
+        <w:t xml:space="preserve">input/</w:t>
+      </w:r>
+      <w:r>
+        <w:t xml:space="preserve">, </w:t>
+      </w:r>
+      <w:r>
+        <w:rPr>
+          <w:rFonts w:ascii="Courier New" w:cs="Courier New" w:eastAsia="Courier New" w:hAnsi="Courier New"/>
+          <w:color w:val="1D2433"/>
+          <w:sz w:val="20"/>
+          <w:szCs w:val="20"/>
+        </w:rPr>
+        <w:t xml:space="preserve">rules/</w:t>
+      </w:r>
+      <w:r>
+        <w:t xml:space="preserve">, atau </w:t>
+      </w:r>
+      <w:r>
+        <w:rPr>
+          <w:rFonts w:ascii="Courier New" w:cs="Courier New" w:eastAsia="Courier New" w:hAnsi="Courier New"/>
+          <w:color w:val="1D2433"/>
+          <w:sz w:val="20"/>
+          <w:szCs w:val="20"/>
+        </w:rPr>
+        <w:t xml:space="preserve">config/</w:t>
+      </w:r>
+      <w:r>
+        <w:t xml:space="preserve">.</w:t>
       </w:r>
     </w:p>
     <w:p>
@@ -1751,20 +2512,73 @@
           <w:ilvl w:val="0"/>
           <w:numId w:val="6"/>
         </w:numPr>
-        <w:spacing w:after="80"/>
+        <w:spacing w:after="60"/>
       </w:pPr>
-      <w:r>
-        <w:t xml:space="preserve">Halaman run menampilkan </w:t>
-      </w:r>
       <w:r>
         <w:rPr>
           <w:b/>
           <w:bCs/>
         </w:rPr>
-        <w:t xml:space="preserve">ringkasan</w:t>
-      </w:r>
-      <w:r>
-        <w:t xml:space="preserve">: jumlah per status, tabel per entitas, daftar akun yang perlu ditinjau, dan peringatan.</w:t>
+        <w:t xml:space="preserve">Manual</w:t>
+      </w:r>
+      <w:r>
+        <w:t xml:space="preserve">: tab </w:t>
+      </w:r>
+      <w:r>
+        <w:rPr>
+          <w:b/>
+          <w:bCs/>
+        </w:rPr>
+        <w:t xml:space="preserve">Actions</w:t>
+      </w:r>
+      <w:r>
+        <w:t xml:space="preserve"> → pilih </w:t>
+      </w:r>
+      <w:r>
+        <w:rPr>
+          <w:b/>
+          <w:bCs/>
+        </w:rPr>
+        <w:t xml:space="preserve">analisis</w:t>
+      </w:r>
+      <w:r>
+        <w:t xml:space="preserve"> di kiri → tombol </w:t>
+      </w:r>
+      <w:r>
+        <w:rPr>
+          <w:b/>
+          <w:bCs/>
+        </w:rPr>
+        <w:t xml:space="preserve">Run workflow</w:t>
+      </w:r>
+      <w:r>
+        <w:t xml:space="preserve"> → </w:t>
+      </w:r>
+      <w:r>
+        <w:rPr>
+          <w:b/>
+          <w:bCs/>
+        </w:rPr>
+        <w:t xml:space="preserve">Run workflow</w:t>
+      </w:r>
+      <w:r>
+        <w:t xml:space="preserve">.</w:t>
+      </w:r>
+    </w:p>
+    <w:p>
+      <w:pPr>
+        <w:spacing w:after="120"/>
+      </w:pPr>
+      <w:r>
+        <w:t xml:space="preserve">Proses biasanya selesai dalam 1–3 menit, tergantung jumlah dan ukuran file.</w:t>
+      </w:r>
+    </w:p>
+    <w:p>
+      <w:pPr>
+        <w:pStyle w:val="Heading2"/>
+      </w:pPr>
+      <w:r>
+        <w:t xml:space="preserve">3.4 Melihat dan mengunduh hasil</w:t>
       </w:r>
     </w:p>
     <w:p>
@@ -1772,7 +2586,53 @@
         <w:pStyle w:val="ListParagraph"/>
         <w:numPr>
           <w:ilvl w:val="0"/>
-          <w:numId w:val="6"/>
+          <w:numId w:val="7"/>
+        </w:numPr>
+        <w:spacing w:after="80"/>
+      </w:pPr>
+      <w:r>
+        <w:t xml:space="preserve">Buka tab </w:t>
+      </w:r>
+      <w:r>
+        <w:rPr>
+          <w:b/>
+          <w:bCs/>
+        </w:rPr>
+        <w:t xml:space="preserve">Actions</w:t>
+      </w:r>
+      <w:r>
+        <w:t xml:space="preserve">, klik run teratas (tanda centang hijau = berhasil).</w:t>
+      </w:r>
+    </w:p>
+    <w:p>
+      <w:pPr>
+        <w:pStyle w:val="ListParagraph"/>
+        <w:numPr>
+          <w:ilvl w:val="0"/>
+          <w:numId w:val="7"/>
+        </w:numPr>
+        <w:spacing w:after="80"/>
+      </w:pPr>
+      <w:r>
+        <w:t xml:space="preserve">Halaman run menampilkan </w:t>
+      </w:r>
+      <w:r>
+        <w:rPr>
+          <w:b/>
+          <w:bCs/>
+        </w:rPr>
+        <w:t xml:space="preserve">ringkasan</w:t>
+      </w:r>
+      <w:r>
+        <w:t xml:space="preserve">: jumlah per status, tabel per entitas, daftar akun yang perlu ditinjau, dan peringatan.</w:t>
+      </w:r>
+    </w:p>
+    <w:p>
+      <w:pPr>
+        <w:pStyle w:val="ListParagraph"/>
+        <w:numPr>
+          <w:ilvl w:val="0"/>
+          <w:numId w:val="7"/>
         </w:numPr>
         <w:spacing w:after="80"/>
       </w:pPr>
@@ -9267,6 +10127,748 @@
                 <w:sz w:val="19"/>
                 <w:szCs w:val="19"/>
               </w:rPr>
+              <w:t xml:space="preserve">ai.aktif</w:t>
+            </w:r>
+          </w:p>
+        </w:tc>
+        <w:tc>
+          <w:tcPr>
+            <w:tcW w:type="dxa" w:w="1444"/>
+            <w:tcBorders>
+              <w:top w:val="single" w:color="C9D1DC" w:sz="4"/>
+              <w:left w:val="single" w:color="C9D1DC" w:sz="4"/>
+              <w:bottom w:val="single" w:color="C9D1DC" w:sz="4"/>
+              <w:right w:val="single" w:color="C9D1DC" w:sz="4"/>
+            </w:tcBorders>
+            <w:tcMar>
+              <w:top w:type="dxa" w:w="60"/>
+              <w:left w:type="dxa" w:w="100"/>
+              <w:bottom w:type="dxa" w:w="60"/>
+              <w:right w:type="dxa" w:w="100"/>
+            </w:tcMar>
+          </w:tcPr>
+          <w:p>
+            <w:r>
+              <w:rPr>
+                <w:b w:val="false"/>
+                <w:bCs w:val="false"/>
+                <w:sz w:val="19"/>
+                <w:szCs w:val="19"/>
+              </w:rPr>
+              <w:t xml:space="preserve">true</w:t>
+            </w:r>
+          </w:p>
+        </w:tc>
+        <w:tc>
+          <w:tcPr>
+            <w:tcW w:type="dxa" w:w="4152"/>
+            <w:tcBorders>
+              <w:top w:val="single" w:color="C9D1DC" w:sz="4"/>
+              <w:left w:val="single" w:color="C9D1DC" w:sz="4"/>
+              <w:bottom w:val="single" w:color="C9D1DC" w:sz="4"/>
+              <w:right w:val="single" w:color="C9D1DC" w:sz="4"/>
+            </w:tcBorders>
+            <w:tcMar>
+              <w:top w:type="dxa" w:w="60"/>
+              <w:left w:type="dxa" w:w="100"/>
+              <w:bottom w:type="dxa" w:w="60"/>
+              <w:right w:type="dxa" w:w="100"/>
+            </w:tcMar>
+          </w:tcPr>
+          <w:p>
+            <w:r>
+              <w:rPr>
+                <w:b w:val="false"/>
+                <w:bCs w:val="false"/>
+                <w:sz w:val="19"/>
+                <w:szCs w:val="19"/>
+              </w:rPr>
+              <w:t xml:space="preserve">Memakai Claude bila secret </w:t>
+            </w:r>
+            <w:r>
+              <w:rPr>
+                <w:rFonts w:ascii="Courier New" w:cs="Courier New" w:eastAsia="Courier New" w:hAnsi="Courier New"/>
+                <w:color w:val="1D2433"/>
+                <w:sz w:val="19"/>
+                <w:szCs w:val="19"/>
+              </w:rPr>
+              <w:t xml:space="preserve">ANTHROPIC_API_KEY</w:t>
+            </w:r>
+            <w:r>
+              <w:rPr>
+                <w:b w:val="false"/>
+                <w:bCs w:val="false"/>
+                <w:sz w:val="19"/>
+                <w:szCs w:val="19"/>
+              </w:rPr>
+              <w:t xml:space="preserve"> tersedia.</w:t>
+            </w:r>
+          </w:p>
+        </w:tc>
+      </w:tr>
+      <w:tr>
+        <w:tc>
+          <w:tcPr>
+            <w:tcW w:type="dxa" w:w="3430"/>
+            <w:tcBorders>
+              <w:top w:val="single" w:color="C9D1DC" w:sz="4"/>
+              <w:left w:val="single" w:color="C9D1DC" w:sz="4"/>
+              <w:bottom w:val="single" w:color="C9D1DC" w:sz="4"/>
+              <w:right w:val="single" w:color="C9D1DC" w:sz="4"/>
+            </w:tcBorders>
+            <w:tcMar>
+              <w:top w:type="dxa" w:w="60"/>
+              <w:left w:type="dxa" w:w="100"/>
+              <w:bottom w:type="dxa" w:w="60"/>
+              <w:right w:type="dxa" w:w="100"/>
+            </w:tcMar>
+          </w:tcPr>
+          <w:p>
+            <w:r>
+              <w:rPr>
+                <w:rFonts w:ascii="Courier New" w:cs="Courier New" w:eastAsia="Courier New" w:hAnsi="Courier New"/>
+                <w:color w:val="1D2433"/>
+                <w:sz w:val="19"/>
+                <w:szCs w:val="19"/>
+              </w:rPr>
+              <w:t xml:space="preserve">ai.model</w:t>
+            </w:r>
+          </w:p>
+        </w:tc>
+        <w:tc>
+          <w:tcPr>
+            <w:tcW w:type="dxa" w:w="1444"/>
+            <w:tcBorders>
+              <w:top w:val="single" w:color="C9D1DC" w:sz="4"/>
+              <w:left w:val="single" w:color="C9D1DC" w:sz="4"/>
+              <w:bottom w:val="single" w:color="C9D1DC" w:sz="4"/>
+              <w:right w:val="single" w:color="C9D1DC" w:sz="4"/>
+            </w:tcBorders>
+            <w:tcMar>
+              <w:top w:type="dxa" w:w="60"/>
+              <w:left w:type="dxa" w:w="100"/>
+              <w:bottom w:type="dxa" w:w="60"/>
+              <w:right w:type="dxa" w:w="100"/>
+            </w:tcMar>
+          </w:tcPr>
+          <w:p>
+            <w:r>
+              <w:rPr>
+                <w:b w:val="false"/>
+                <w:bCs w:val="false"/>
+                <w:sz w:val="19"/>
+                <w:szCs w:val="19"/>
+              </w:rPr>
+              <w:t xml:space="preserve">claude-opus-5-5</w:t>
+            </w:r>
+          </w:p>
+        </w:tc>
+        <w:tc>
+          <w:tcPr>
+            <w:tcW w:type="dxa" w:w="4152"/>
+            <w:tcBorders>
+              <w:top w:val="single" w:color="C9D1DC" w:sz="4"/>
+              <w:left w:val="single" w:color="C9D1DC" w:sz="4"/>
+              <w:bottom w:val="single" w:color="C9D1DC" w:sz="4"/>
+              <w:right w:val="single" w:color="C9D1DC" w:sz="4"/>
+            </w:tcBorders>
+            <w:tcMar>
+              <w:top w:type="dxa" w:w="60"/>
+              <w:left w:type="dxa" w:w="100"/>
+              <w:bottom w:type="dxa" w:w="60"/>
+              <w:right w:type="dxa" w:w="100"/>
+            </w:tcMar>
+          </w:tcPr>
+          <w:p>
+            <w:r>
+              <w:rPr>
+                <w:b w:val="false"/>
+                <w:bCs w:val="false"/>
+                <w:sz w:val="19"/>
+                <w:szCs w:val="19"/>
+              </w:rPr>
+              <w:t xml:space="preserve">Model Claude; mis. </w:t>
+            </w:r>
+            <w:r>
+              <w:rPr>
+                <w:rFonts w:ascii="Courier New" w:cs="Courier New" w:eastAsia="Courier New" w:hAnsi="Courier New"/>
+                <w:color w:val="1D2433"/>
+                <w:sz w:val="19"/>
+                <w:szCs w:val="19"/>
+              </w:rPr>
+              <w:t xml:space="preserve">claude-sonnet-5-5</w:t>
+            </w:r>
+            <w:r>
+              <w:rPr>
+                <w:b w:val="false"/>
+                <w:bCs w:val="false"/>
+                <w:sz w:val="19"/>
+                <w:szCs w:val="19"/>
+              </w:rPr>
+              <w:t xml:space="preserve"> atau </w:t>
+            </w:r>
+            <w:r>
+              <w:rPr>
+                <w:rFonts w:ascii="Courier New" w:cs="Courier New" w:eastAsia="Courier New" w:hAnsi="Courier New"/>
+                <w:color w:val="1D2433"/>
+                <w:sz w:val="19"/>
+                <w:szCs w:val="19"/>
+              </w:rPr>
+              <w:t xml:space="preserve">claude-haiku-5-5</w:t>
+            </w:r>
+            <w:r>
+              <w:rPr>
+                <w:b w:val="false"/>
+                <w:bCs w:val="false"/>
+                <w:sz w:val="19"/>
+                <w:szCs w:val="19"/>
+              </w:rPr>
+              <w:t xml:space="preserve"> untuk biaya lebih rendah.</w:t>
+            </w:r>
+          </w:p>
+        </w:tc>
+      </w:tr>
+      <w:tr>
+        <w:tc>
+          <w:tcPr>
+            <w:tcW w:type="dxa" w:w="3430"/>
+            <w:tcBorders>
+              <w:top w:val="single" w:color="C9D1DC" w:sz="4"/>
+              <w:left w:val="single" w:color="C9D1DC" w:sz="4"/>
+              <w:bottom w:val="single" w:color="C9D1DC" w:sz="4"/>
+              <w:right w:val="single" w:color="C9D1DC" w:sz="4"/>
+            </w:tcBorders>
+            <w:tcMar>
+              <w:top w:type="dxa" w:w="60"/>
+              <w:left w:type="dxa" w:w="100"/>
+              <w:bottom w:type="dxa" w:w="60"/>
+              <w:right w:type="dxa" w:w="100"/>
+            </w:tcMar>
+          </w:tcPr>
+          <w:p>
+            <w:r>
+              <w:rPr>
+                <w:rFonts w:ascii="Courier New" w:cs="Courier New" w:eastAsia="Courier New" w:hAnsi="Courier New"/>
+                <w:color w:val="1D2433"/>
+                <w:sz w:val="19"/>
+                <w:szCs w:val="19"/>
+              </w:rPr>
+              <w:t xml:space="preserve">ai.effort</w:t>
+            </w:r>
+          </w:p>
+        </w:tc>
+        <w:tc>
+          <w:tcPr>
+            <w:tcW w:type="dxa" w:w="1444"/>
+            <w:tcBorders>
+              <w:top w:val="single" w:color="C9D1DC" w:sz="4"/>
+              <w:left w:val="single" w:color="C9D1DC" w:sz="4"/>
+              <w:bottom w:val="single" w:color="C9D1DC" w:sz="4"/>
+              <w:right w:val="single" w:color="C9D1DC" w:sz="4"/>
+            </w:tcBorders>
+            <w:tcMar>
+              <w:top w:type="dxa" w:w="60"/>
+              <w:left w:type="dxa" w:w="100"/>
+              <w:bottom w:type="dxa" w:w="60"/>
+              <w:right w:type="dxa" w:w="100"/>
+            </w:tcMar>
+          </w:tcPr>
+          <w:p>
+            <w:r>
+              <w:rPr>
+                <w:b w:val="false"/>
+                <w:bCs w:val="false"/>
+                <w:sz w:val="19"/>
+                <w:szCs w:val="19"/>
+              </w:rPr>
+              <w:t xml:space="preserve">medium</w:t>
+            </w:r>
+          </w:p>
+        </w:tc>
+        <w:tc>
+          <w:tcPr>
+            <w:tcW w:type="dxa" w:w="4152"/>
+            <w:tcBorders>
+              <w:top w:val="single" w:color="C9D1DC" w:sz="4"/>
+              <w:left w:val="single" w:color="C9D1DC" w:sz="4"/>
+              <w:bottom w:val="single" w:color="C9D1DC" w:sz="4"/>
+              <w:right w:val="single" w:color="C9D1DC" w:sz="4"/>
+            </w:tcBorders>
+            <w:tcMar>
+              <w:top w:type="dxa" w:w="60"/>
+              <w:left w:type="dxa" w:w="100"/>
+              <w:bottom w:type="dxa" w:w="60"/>
+              <w:right w:type="dxa" w:w="100"/>
+            </w:tcMar>
+          </w:tcPr>
+          <w:p>
+            <w:r>
+              <w:rPr>
+                <w:b w:val="false"/>
+                <w:bCs w:val="false"/>
+                <w:sz w:val="19"/>
+                <w:szCs w:val="19"/>
+              </w:rPr>
+              <w:t xml:space="preserve">Kedalaman berpikir: low / medium / high / xhigh / max.</w:t>
+            </w:r>
+          </w:p>
+        </w:tc>
+      </w:tr>
+      <w:tr>
+        <w:tc>
+          <w:tcPr>
+            <w:tcW w:type="dxa" w:w="3430"/>
+            <w:tcBorders>
+              <w:top w:val="single" w:color="C9D1DC" w:sz="4"/>
+              <w:left w:val="single" w:color="C9D1DC" w:sz="4"/>
+              <w:bottom w:val="single" w:color="C9D1DC" w:sz="4"/>
+              <w:right w:val="single" w:color="C9D1DC" w:sz="4"/>
+            </w:tcBorders>
+            <w:tcMar>
+              <w:top w:type="dxa" w:w="60"/>
+              <w:left w:type="dxa" w:w="100"/>
+              <w:bottom w:type="dxa" w:w="60"/>
+              <w:right w:type="dxa" w:w="100"/>
+            </w:tcMar>
+          </w:tcPr>
+          <w:p>
+            <w:r>
+              <w:rPr>
+                <w:rFonts w:ascii="Courier New" w:cs="Courier New" w:eastAsia="Courier New" w:hAnsi="Courier New"/>
+                <w:color w:val="1D2433"/>
+                <w:sz w:val="19"/>
+                <w:szCs w:val="19"/>
+              </w:rPr>
+              <w:t xml:space="preserve">ai.fallback_server</w:t>
+            </w:r>
+          </w:p>
+        </w:tc>
+        <w:tc>
+          <w:tcPr>
+            <w:tcW w:type="dxa" w:w="1444"/>
+            <w:tcBorders>
+              <w:top w:val="single" w:color="C9D1DC" w:sz="4"/>
+              <w:left w:val="single" w:color="C9D1DC" w:sz="4"/>
+              <w:bottom w:val="single" w:color="C9D1DC" w:sz="4"/>
+              <w:right w:val="single" w:color="C9D1DC" w:sz="4"/>
+            </w:tcBorders>
+            <w:tcMar>
+              <w:top w:type="dxa" w:w="60"/>
+              <w:left w:type="dxa" w:w="100"/>
+              <w:bottom w:type="dxa" w:w="60"/>
+              <w:right w:type="dxa" w:w="100"/>
+            </w:tcMar>
+          </w:tcPr>
+          <w:p>
+            <w:r>
+              <w:rPr>
+                <w:b w:val="false"/>
+                <w:bCs w:val="false"/>
+                <w:sz w:val="19"/>
+                <w:szCs w:val="19"/>
+              </w:rPr>
+              <w:t xml:space="preserve">true</w:t>
+            </w:r>
+          </w:p>
+        </w:tc>
+        <w:tc>
+          <w:tcPr>
+            <w:tcW w:type="dxa" w:w="4152"/>
+            <w:tcBorders>
+              <w:top w:val="single" w:color="C9D1DC" w:sz="4"/>
+              <w:left w:val="single" w:color="C9D1DC" w:sz="4"/>
+              <w:bottom w:val="single" w:color="C9D1DC" w:sz="4"/>
+              <w:right w:val="single" w:color="C9D1DC" w:sz="4"/>
+            </w:tcBorders>
+            <w:tcMar>
+              <w:top w:type="dxa" w:w="60"/>
+              <w:left w:type="dxa" w:w="100"/>
+              <w:bottom w:type="dxa" w:w="60"/>
+              <w:right w:type="dxa" w:w="100"/>
+            </w:tcMar>
+          </w:tcPr>
+          <w:p>
+            <w:r>
+              <w:rPr>
+                <w:b w:val="false"/>
+                <w:bCs w:val="false"/>
+                <w:sz w:val="19"/>
+                <w:szCs w:val="19"/>
+              </w:rPr>
+              <w:t xml:space="preserve">Bila model menolak permintaan, API mencoba model cadangan otomatis.</w:t>
+            </w:r>
+          </w:p>
+        </w:tc>
+      </w:tr>
+      <w:tr>
+        <w:tc>
+          <w:tcPr>
+            <w:tcW w:type="dxa" w:w="3430"/>
+            <w:tcBorders>
+              <w:top w:val="single" w:color="C9D1DC" w:sz="4"/>
+              <w:left w:val="single" w:color="C9D1DC" w:sz="4"/>
+              <w:bottom w:val="single" w:color="C9D1DC" w:sz="4"/>
+              <w:right w:val="single" w:color="C9D1DC" w:sz="4"/>
+            </w:tcBorders>
+            <w:tcMar>
+              <w:top w:type="dxa" w:w="60"/>
+              <w:left w:type="dxa" w:w="100"/>
+              <w:bottom w:type="dxa" w:w="60"/>
+              <w:right w:type="dxa" w:w="100"/>
+            </w:tcMar>
+          </w:tcPr>
+          <w:p>
+            <w:r>
+              <w:rPr>
+                <w:rFonts w:ascii="Courier New" w:cs="Courier New" w:eastAsia="Courier New" w:hAnsi="Courier New"/>
+                <w:color w:val="1D2433"/>
+                <w:sz w:val="19"/>
+                <w:szCs w:val="19"/>
+              </w:rPr>
+              <w:t xml:space="preserve">ai.maks_mb_pdf</w:t>
+            </w:r>
+          </w:p>
+        </w:tc>
+        <w:tc>
+          <w:tcPr>
+            <w:tcW w:type="dxa" w:w="1444"/>
+            <w:tcBorders>
+              <w:top w:val="single" w:color="C9D1DC" w:sz="4"/>
+              <w:left w:val="single" w:color="C9D1DC" w:sz="4"/>
+              <w:bottom w:val="single" w:color="C9D1DC" w:sz="4"/>
+              <w:right w:val="single" w:color="C9D1DC" w:sz="4"/>
+            </w:tcBorders>
+            <w:tcMar>
+              <w:top w:type="dxa" w:w="60"/>
+              <w:left w:type="dxa" w:w="100"/>
+              <w:bottom w:type="dxa" w:w="60"/>
+              <w:right w:type="dxa" w:w="100"/>
+            </w:tcMar>
+          </w:tcPr>
+          <w:p>
+            <w:r>
+              <w:rPr>
+                <w:b w:val="false"/>
+                <w:bCs w:val="false"/>
+                <w:sz w:val="19"/>
+                <w:szCs w:val="19"/>
+              </w:rPr>
+              <w:t xml:space="preserve">30</w:t>
+            </w:r>
+          </w:p>
+        </w:tc>
+        <w:tc>
+          <w:tcPr>
+            <w:tcW w:type="dxa" w:w="4152"/>
+            <w:tcBorders>
+              <w:top w:val="single" w:color="C9D1DC" w:sz="4"/>
+              <w:left w:val="single" w:color="C9D1DC" w:sz="4"/>
+              <w:bottom w:val="single" w:color="C9D1DC" w:sz="4"/>
+              <w:right w:val="single" w:color="C9D1DC" w:sz="4"/>
+            </w:tcBorders>
+            <w:tcMar>
+              <w:top w:type="dxa" w:w="60"/>
+              <w:left w:type="dxa" w:w="100"/>
+              <w:bottom w:type="dxa" w:w="60"/>
+              <w:right w:type="dxa" w:w="100"/>
+            </w:tcMar>
+          </w:tcPr>
+          <w:p>
+            <w:r>
+              <w:rPr>
+                <w:b w:val="false"/>
+                <w:bCs w:val="false"/>
+                <w:sz w:val="19"/>
+                <w:szCs w:val="19"/>
+              </w:rPr>
+              <w:t xml:space="preserve">PDF lebih besar dari ini diproses dengan aturan (batas API 32 MB).</w:t>
+            </w:r>
+          </w:p>
+        </w:tc>
+      </w:tr>
+      <w:tr>
+        <w:tc>
+          <w:tcPr>
+            <w:tcW w:type="dxa" w:w="3430"/>
+            <w:tcBorders>
+              <w:top w:val="single" w:color="C9D1DC" w:sz="4"/>
+              <w:left w:val="single" w:color="C9D1DC" w:sz="4"/>
+              <w:bottom w:val="single" w:color="C9D1DC" w:sz="4"/>
+              <w:right w:val="single" w:color="C9D1DC" w:sz="4"/>
+            </w:tcBorders>
+            <w:tcMar>
+              <w:top w:type="dxa" w:w="60"/>
+              <w:left w:type="dxa" w:w="100"/>
+              <w:bottom w:type="dxa" w:w="60"/>
+              <w:right w:type="dxa" w:w="100"/>
+            </w:tcMar>
+          </w:tcPr>
+          <w:p>
+            <w:r>
+              <w:rPr>
+                <w:rFonts w:ascii="Courier New" w:cs="Courier New" w:eastAsia="Courier New" w:hAnsi="Courier New"/>
+                <w:color w:val="1D2433"/>
+                <w:sz w:val="19"/>
+                <w:szCs w:val="19"/>
+              </w:rPr>
+              <w:t xml:space="preserve">ai.ekstraksi_pdf</w:t>
+            </w:r>
+          </w:p>
+        </w:tc>
+        <w:tc>
+          <w:tcPr>
+            <w:tcW w:type="dxa" w:w="1444"/>
+            <w:tcBorders>
+              <w:top w:val="single" w:color="C9D1DC" w:sz="4"/>
+              <w:left w:val="single" w:color="C9D1DC" w:sz="4"/>
+              <w:bottom w:val="single" w:color="C9D1DC" w:sz="4"/>
+              <w:right w:val="single" w:color="C9D1DC" w:sz="4"/>
+            </w:tcBorders>
+            <w:tcMar>
+              <w:top w:type="dxa" w:w="60"/>
+              <w:left w:type="dxa" w:w="100"/>
+              <w:bottom w:type="dxa" w:w="60"/>
+              <w:right w:type="dxa" w:w="100"/>
+            </w:tcMar>
+          </w:tcPr>
+          <w:p>
+            <w:r>
+              <w:rPr>
+                <w:b w:val="false"/>
+                <w:bCs w:val="false"/>
+                <w:sz w:val="19"/>
+                <w:szCs w:val="19"/>
+              </w:rPr>
+              <w:t xml:space="preserve">true</w:t>
+            </w:r>
+          </w:p>
+        </w:tc>
+        <w:tc>
+          <w:tcPr>
+            <w:tcW w:type="dxa" w:w="4152"/>
+            <w:tcBorders>
+              <w:top w:val="single" w:color="C9D1DC" w:sz="4"/>
+              <w:left w:val="single" w:color="C9D1DC" w:sz="4"/>
+              <w:bottom w:val="single" w:color="C9D1DC" w:sz="4"/>
+              <w:right w:val="single" w:color="C9D1DC" w:sz="4"/>
+            </w:tcBorders>
+            <w:tcMar>
+              <w:top w:type="dxa" w:w="60"/>
+              <w:left w:type="dxa" w:w="100"/>
+              <w:bottom w:type="dxa" w:w="60"/>
+              <w:right w:type="dxa" w:w="100"/>
+            </w:tcMar>
+          </w:tcPr>
+          <w:p>
+            <w:r>
+              <w:rPr>
+                <w:b w:val="false"/>
+                <w:bCs w:val="false"/>
+                <w:sz w:val="19"/>
+                <w:szCs w:val="19"/>
+              </w:rPr>
+              <w:t xml:space="preserve">Claude membaca PDF: seksi, satuan, angka akun.</w:t>
+            </w:r>
+          </w:p>
+        </w:tc>
+      </w:tr>
+      <w:tr>
+        <w:tc>
+          <w:tcPr>
+            <w:tcW w:type="dxa" w:w="3430"/>
+            <w:tcBorders>
+              <w:top w:val="single" w:color="C9D1DC" w:sz="4"/>
+              <w:left w:val="single" w:color="C9D1DC" w:sz="4"/>
+              <w:bottom w:val="single" w:color="C9D1DC" w:sz="4"/>
+              <w:right w:val="single" w:color="C9D1DC" w:sz="4"/>
+            </w:tcBorders>
+            <w:tcMar>
+              <w:top w:type="dxa" w:w="60"/>
+              <w:left w:type="dxa" w:w="100"/>
+              <w:bottom w:type="dxa" w:w="60"/>
+              <w:right w:type="dxa" w:w="100"/>
+            </w:tcMar>
+          </w:tcPr>
+          <w:p>
+            <w:r>
+              <w:rPr>
+                <w:rFonts w:ascii="Courier New" w:cs="Courier New" w:eastAsia="Courier New" w:hAnsi="Courier New"/>
+                <w:color w:val="1D2433"/>
+                <w:sz w:val="19"/>
+                <w:szCs w:val="19"/>
+              </w:rPr>
+              <w:t xml:space="preserve">ai.pemetaan_excel</w:t>
+            </w:r>
+          </w:p>
+        </w:tc>
+        <w:tc>
+          <w:tcPr>
+            <w:tcW w:type="dxa" w:w="1444"/>
+            <w:tcBorders>
+              <w:top w:val="single" w:color="C9D1DC" w:sz="4"/>
+              <w:left w:val="single" w:color="C9D1DC" w:sz="4"/>
+              <w:bottom w:val="single" w:color="C9D1DC" w:sz="4"/>
+              <w:right w:val="single" w:color="C9D1DC" w:sz="4"/>
+            </w:tcBorders>
+            <w:tcMar>
+              <w:top w:type="dxa" w:w="60"/>
+              <w:left w:type="dxa" w:w="100"/>
+              <w:bottom w:type="dxa" w:w="60"/>
+              <w:right w:type="dxa" w:w="100"/>
+            </w:tcMar>
+          </w:tcPr>
+          <w:p>
+            <w:r>
+              <w:rPr>
+                <w:b w:val="false"/>
+                <w:bCs w:val="false"/>
+                <w:sz w:val="19"/>
+                <w:szCs w:val="19"/>
+              </w:rPr>
+              <w:t xml:space="preserve">true</w:t>
+            </w:r>
+          </w:p>
+        </w:tc>
+        <w:tc>
+          <w:tcPr>
+            <w:tcW w:type="dxa" w:w="4152"/>
+            <w:tcBorders>
+              <w:top w:val="single" w:color="C9D1DC" w:sz="4"/>
+              <w:left w:val="single" w:color="C9D1DC" w:sz="4"/>
+              <w:bottom w:val="single" w:color="C9D1DC" w:sz="4"/>
+              <w:right w:val="single" w:color="C9D1DC" w:sz="4"/>
+            </w:tcBorders>
+            <w:tcMar>
+              <w:top w:type="dxa" w:w="60"/>
+              <w:left w:type="dxa" w:w="100"/>
+              <w:bottom w:type="dxa" w:w="60"/>
+              <w:right w:type="dxa" w:w="100"/>
+            </w:tcMar>
+          </w:tcPr>
+          <w:p>
+            <w:r>
+              <w:rPr>
+                <w:b w:val="false"/>
+                <w:bCs w:val="false"/>
+                <w:sz w:val="19"/>
+                <w:szCs w:val="19"/>
+              </w:rPr>
+              <w:t xml:space="preserve">Claude memetakan label Excel yang tidak dikenali rules.</w:t>
+            </w:r>
+          </w:p>
+        </w:tc>
+      </w:tr>
+      <w:tr>
+        <w:tc>
+          <w:tcPr>
+            <w:tcW w:type="dxa" w:w="3430"/>
+            <w:tcBorders>
+              <w:top w:val="single" w:color="C9D1DC" w:sz="4"/>
+              <w:left w:val="single" w:color="C9D1DC" w:sz="4"/>
+              <w:bottom w:val="single" w:color="C9D1DC" w:sz="4"/>
+              <w:right w:val="single" w:color="C9D1DC" w:sz="4"/>
+            </w:tcBorders>
+            <w:tcMar>
+              <w:top w:type="dxa" w:w="60"/>
+              <w:left w:type="dxa" w:w="100"/>
+              <w:bottom w:type="dxa" w:w="60"/>
+              <w:right w:type="dxa" w:w="100"/>
+            </w:tcMar>
+          </w:tcPr>
+          <w:p>
+            <w:r>
+              <w:rPr>
+                <w:rFonts w:ascii="Courier New" w:cs="Courier New" w:eastAsia="Courier New" w:hAnsi="Courier New"/>
+                <w:color w:val="1D2433"/>
+                <w:sz w:val="19"/>
+                <w:szCs w:val="19"/>
+              </w:rPr>
+              <w:t xml:space="preserve">ai.catatan_dan_kesimpulan</w:t>
+            </w:r>
+          </w:p>
+        </w:tc>
+        <w:tc>
+          <w:tcPr>
+            <w:tcW w:type="dxa" w:w="1444"/>
+            <w:tcBorders>
+              <w:top w:val="single" w:color="C9D1DC" w:sz="4"/>
+              <w:left w:val="single" w:color="C9D1DC" w:sz="4"/>
+              <w:bottom w:val="single" w:color="C9D1DC" w:sz="4"/>
+              <w:right w:val="single" w:color="C9D1DC" w:sz="4"/>
+            </w:tcBorders>
+            <w:tcMar>
+              <w:top w:type="dxa" w:w="60"/>
+              <w:left w:type="dxa" w:w="100"/>
+              <w:bottom w:type="dxa" w:w="60"/>
+              <w:right w:type="dxa" w:w="100"/>
+            </w:tcMar>
+          </w:tcPr>
+          <w:p>
+            <w:r>
+              <w:rPr>
+                <w:b w:val="false"/>
+                <w:bCs w:val="false"/>
+                <w:sz w:val="19"/>
+                <w:szCs w:val="19"/>
+              </w:rPr>
+              <w:t xml:space="preserve">true</w:t>
+            </w:r>
+          </w:p>
+        </w:tc>
+        <w:tc>
+          <w:tcPr>
+            <w:tcW w:type="dxa" w:w="4152"/>
+            <w:tcBorders>
+              <w:top w:val="single" w:color="C9D1DC" w:sz="4"/>
+              <w:left w:val="single" w:color="C9D1DC" w:sz="4"/>
+              <w:bottom w:val="single" w:color="C9D1DC" w:sz="4"/>
+              <w:right w:val="single" w:color="C9D1DC" w:sz="4"/>
+            </w:tcBorders>
+            <w:tcMar>
+              <w:top w:type="dxa" w:w="60"/>
+              <w:left w:type="dxa" w:w="100"/>
+              <w:bottom w:type="dxa" w:w="60"/>
+              <w:right w:type="dxa" w:w="100"/>
+            </w:tcMar>
+          </w:tcPr>
+          <w:p>
+            <w:r>
+              <w:rPr>
+                <w:b w:val="false"/>
+                <w:bCs w:val="false"/>
+                <w:sz w:val="19"/>
+                <w:szCs w:val="19"/>
+              </w:rPr>
+              <w:t xml:space="preserve">Catatan per baris bukan MATCH + kesimpulan dan rekomendasi.</w:t>
+            </w:r>
+          </w:p>
+        </w:tc>
+      </w:tr>
+      <w:tr>
+        <w:tc>
+          <w:tcPr>
+            <w:tcW w:type="dxa" w:w="3430"/>
+            <w:tcBorders>
+              <w:top w:val="single" w:color="C9D1DC" w:sz="4"/>
+              <w:left w:val="single" w:color="C9D1DC" w:sz="4"/>
+              <w:bottom w:val="single" w:color="C9D1DC" w:sz="4"/>
+              <w:right w:val="single" w:color="C9D1DC" w:sz="4"/>
+            </w:tcBorders>
+            <w:tcMar>
+              <w:top w:type="dxa" w:w="60"/>
+              <w:left w:type="dxa" w:w="100"/>
+              <w:bottom w:type="dxa" w:w="60"/>
+              <w:right w:type="dxa" w:w="100"/>
+            </w:tcMar>
+          </w:tcPr>
+          <w:p>
+            <w:r>
+              <w:rPr>
+                <w:rFonts w:ascii="Courier New" w:cs="Courier New" w:eastAsia="Courier New" w:hAnsi="Courier New"/>
+                <w:color w:val="1D2433"/>
+                <w:sz w:val="19"/>
+                <w:szCs w:val="19"/>
+              </w:rPr>
               <w:t xml:space="preserve">komparasi.periode</w:t>
             </w:r>
           </w:p>
@@ -10849,7 +12451,7 @@
                 <w:sz w:val="19"/>
                 <w:szCs w:val="19"/>
               </w:rPr>
-              <w:t xml:space="preserve">Penjelasan otomatis sesuai status.</w:t>
+              <w:t xml:space="preserve">Penjelasan per baris (dari AI bila aktif, selain itu template).</w:t>
             </w:r>
           </w:p>
         </w:tc>
@@ -10879,6 +12481,91 @@
                 <w:sz w:val="19"/>
                 <w:szCs w:val="19"/>
               </w:rPr>
+              <w:t xml:space="preserve">sumber_catatan</w:t>
+            </w:r>
+          </w:p>
+        </w:tc>
+        <w:tc>
+          <w:tcPr>
+            <w:tcW w:type="dxa" w:w="6679"/>
+            <w:tcBorders>
+              <w:top w:val="single" w:color="C9D1DC" w:sz="4"/>
+              <w:left w:val="single" w:color="C9D1DC" w:sz="4"/>
+              <w:bottom w:val="single" w:color="C9D1DC" w:sz="4"/>
+              <w:right w:val="single" w:color="C9D1DC" w:sz="4"/>
+            </w:tcBorders>
+            <w:tcMar>
+              <w:top w:type="dxa" w:w="60"/>
+              <w:left w:type="dxa" w:w="100"/>
+              <w:bottom w:type="dxa" w:w="60"/>
+              <w:right w:type="dxa" w:w="100"/>
+            </w:tcMar>
+          </w:tcPr>
+          <w:p>
+            <w:r>
+              <w:rPr>
+                <w:rFonts w:ascii="Courier New" w:cs="Courier New" w:eastAsia="Courier New" w:hAnsi="Courier New"/>
+                <w:color w:val="1D2433"/>
+                <w:sz w:val="19"/>
+                <w:szCs w:val="19"/>
+              </w:rPr>
+              <w:t xml:space="preserve">ai</w:t>
+            </w:r>
+            <w:r>
+              <w:rPr>
+                <w:b w:val="false"/>
+                <w:bCs w:val="false"/>
+                <w:sz w:val="19"/>
+                <w:szCs w:val="19"/>
+              </w:rPr>
+              <w:t xml:space="preserve"> atau </w:t>
+            </w:r>
+            <w:r>
+              <w:rPr>
+                <w:rFonts w:ascii="Courier New" w:cs="Courier New" w:eastAsia="Courier New" w:hAnsi="Courier New"/>
+                <w:color w:val="1D2433"/>
+                <w:sz w:val="19"/>
+                <w:szCs w:val="19"/>
+              </w:rPr>
+              <w:t xml:space="preserve">otomatis</w:t>
+            </w:r>
+            <w:r>
+              <w:rPr>
+                <w:b w:val="false"/>
+                <w:bCs w:val="false"/>
+                <w:sz w:val="19"/>
+                <w:szCs w:val="19"/>
+              </w:rPr>
+              <w:t xml:space="preserve">.</w:t>
+            </w:r>
+          </w:p>
+        </w:tc>
+      </w:tr>
+      <w:tr>
+        <w:tc>
+          <w:tcPr>
+            <w:tcW w:type="dxa" w:w="2347"/>
+            <w:tcBorders>
+              <w:top w:val="single" w:color="C9D1DC" w:sz="4"/>
+              <w:left w:val="single" w:color="C9D1DC" w:sz="4"/>
+              <w:bottom w:val="single" w:color="C9D1DC" w:sz="4"/>
+              <w:right w:val="single" w:color="C9D1DC" w:sz="4"/>
+            </w:tcBorders>
+            <w:tcMar>
+              <w:top w:type="dxa" w:w="60"/>
+              <w:left w:type="dxa" w:w="100"/>
+              <w:bottom w:type="dxa" w:w="60"/>
+              <w:right w:type="dxa" w:w="100"/>
+            </w:tcMar>
+          </w:tcPr>
+          <w:p>
+            <w:r>
+              <w:rPr>
+                <w:rFonts w:ascii="Courier New" w:cs="Courier New" w:eastAsia="Courier New" w:hAnsi="Courier New"/>
+                <w:color w:val="1D2433"/>
+                <w:sz w:val="19"/>
+                <w:szCs w:val="19"/>
+              </w:rPr>
               <w:t xml:space="preserve">halaman_pdf</w:t>
             </w:r>
           </w:p>
@@ -10908,6 +12595,118 @@
                 <w:szCs w:val="19"/>
               </w:rPr>
               <w:t xml:space="preserve">Halaman PDF tempat angka ditemukan.</w:t>
+            </w:r>
+          </w:p>
+        </w:tc>
+      </w:tr>
+      <w:tr>
+        <w:tc>
+          <w:tcPr>
+            <w:tcW w:type="dxa" w:w="2347"/>
+            <w:tcBorders>
+              <w:top w:val="single" w:color="C9D1DC" w:sz="4"/>
+              <w:left w:val="single" w:color="C9D1DC" w:sz="4"/>
+              <w:bottom w:val="single" w:color="C9D1DC" w:sz="4"/>
+              <w:right w:val="single" w:color="C9D1DC" w:sz="4"/>
+            </w:tcBorders>
+            <w:tcMar>
+              <w:top w:type="dxa" w:w="60"/>
+              <w:left w:type="dxa" w:w="100"/>
+              <w:bottom w:type="dxa" w:w="60"/>
+              <w:right w:type="dxa" w:w="100"/>
+            </w:tcMar>
+          </w:tcPr>
+          <w:p>
+            <w:r>
+              <w:rPr>
+                <w:rFonts w:ascii="Courier New" w:cs="Courier New" w:eastAsia="Courier New" w:hAnsi="Courier New"/>
+                <w:color w:val="1D2433"/>
+                <w:sz w:val="19"/>
+                <w:szCs w:val="19"/>
+              </w:rPr>
+              <w:t xml:space="preserve">verifikasi_pdf</w:t>
+            </w:r>
+          </w:p>
+        </w:tc>
+        <w:tc>
+          <w:tcPr>
+            <w:tcW w:type="dxa" w:w="6679"/>
+            <w:tcBorders>
+              <w:top w:val="single" w:color="C9D1DC" w:sz="4"/>
+              <w:left w:val="single" w:color="C9D1DC" w:sz="4"/>
+              <w:bottom w:val="single" w:color="C9D1DC" w:sz="4"/>
+              <w:right w:val="single" w:color="C9D1DC" w:sz="4"/>
+            </w:tcBorders>
+            <w:tcMar>
+              <w:top w:type="dxa" w:w="60"/>
+              <w:left w:type="dxa" w:w="100"/>
+              <w:bottom w:type="dxa" w:w="60"/>
+              <w:right w:type="dxa" w:w="100"/>
+            </w:tcMar>
+          </w:tcPr>
+          <w:p>
+            <w:r>
+              <w:rPr>
+                <w:b w:val="false"/>
+                <w:bCs w:val="false"/>
+                <w:sz w:val="19"/>
+                <w:szCs w:val="19"/>
+              </w:rPr>
+              <w:t xml:space="preserve">Cek angka PDF ke teks halaman: </w:t>
+            </w:r>
+            <w:r>
+              <w:rPr>
+                <w:rFonts w:ascii="Courier New" w:cs="Courier New" w:eastAsia="Courier New" w:hAnsi="Courier New"/>
+                <w:color w:val="1D2433"/>
+                <w:sz w:val="19"/>
+                <w:szCs w:val="19"/>
+              </w:rPr>
+              <w:t xml:space="preserve">cocok</w:t>
+            </w:r>
+            <w:r>
+              <w:rPr>
+                <w:b w:val="false"/>
+                <w:bCs w:val="false"/>
+                <w:sz w:val="19"/>
+                <w:szCs w:val="19"/>
+              </w:rPr>
+              <w:t xml:space="preserve">, </w:t>
+            </w:r>
+            <w:r>
+              <w:rPr>
+                <w:rFonts w:ascii="Courier New" w:cs="Courier New" w:eastAsia="Courier New" w:hAnsi="Courier New"/>
+                <w:color w:val="1D2433"/>
+                <w:sz w:val="19"/>
+                <w:szCs w:val="19"/>
+              </w:rPr>
+              <w:t xml:space="preserve">tidak_ditemukan_di_halaman</w:t>
+            </w:r>
+            <w:r>
+              <w:rPr>
+                <w:b w:val="false"/>
+                <w:bCs w:val="false"/>
+                <w:sz w:val="19"/>
+                <w:szCs w:val="19"/>
+              </w:rPr>
+              <w:t xml:space="preserve">, atau </w:t>
+            </w:r>
+            <w:r>
+              <w:rPr>
+                <w:rFonts w:ascii="Courier New" w:cs="Courier New" w:eastAsia="Courier New" w:hAnsi="Courier New"/>
+                <w:color w:val="1D2433"/>
+                <w:sz w:val="19"/>
+                <w:szCs w:val="19"/>
+              </w:rPr>
+              <w:t xml:space="preserve">tanpa_teks</w:t>
+            </w:r>
+            <w:r>
+              <w:rPr>
+                <w:b w:val="false"/>
+                <w:bCs w:val="false"/>
+                <w:sz w:val="19"/>
+                <w:szCs w:val="19"/>
+              </w:rPr>
+              <w:t xml:space="preserve"> (PDF scan).</w:t>
             </w:r>
           </w:p>
         </w:tc>
@@ -12169,6 +13968,149 @@
           </w:p>
         </w:tc>
       </w:tr>
+      <w:tr>
+        <w:tc>
+          <w:tcPr>
+            <w:tcW w:type="dxa" w:w="2347"/>
+            <w:tcBorders>
+              <w:top w:val="single" w:color="C9D1DC" w:sz="4"/>
+              <w:left w:val="single" w:color="C9D1DC" w:sz="4"/>
+              <w:bottom w:val="single" w:color="C9D1DC" w:sz="4"/>
+              <w:right w:val="single" w:color="C9D1DC" w:sz="4"/>
+            </w:tcBorders>
+            <w:tcMar>
+              <w:top w:type="dxa" w:w="60"/>
+              <w:left w:type="dxa" w:w="100"/>
+              <w:bottom w:type="dxa" w:w="60"/>
+              <w:right w:type="dxa" w:w="100"/>
+            </w:tcMar>
+          </w:tcPr>
+          <w:p>
+            <w:r>
+              <w:rPr>
+                <w:rFonts w:ascii="Courier New" w:cs="Courier New" w:eastAsia="Courier New" w:hAnsi="Courier New"/>
+                <w:color w:val="1D2433"/>
+                <w:sz w:val="19"/>
+                <w:szCs w:val="19"/>
+              </w:rPr>
+              <w:t xml:space="preserve">sumber_ekstraksi</w:t>
+            </w:r>
+          </w:p>
+        </w:tc>
+        <w:tc>
+          <w:tcPr>
+            <w:tcW w:type="dxa" w:w="6679"/>
+            <w:tcBorders>
+              <w:top w:val="single" w:color="C9D1DC" w:sz="4"/>
+              <w:left w:val="single" w:color="C9D1DC" w:sz="4"/>
+              <w:bottom w:val="single" w:color="C9D1DC" w:sz="4"/>
+              <w:right w:val="single" w:color="C9D1DC" w:sz="4"/>
+            </w:tcBorders>
+            <w:tcMar>
+              <w:top w:type="dxa" w:w="60"/>
+              <w:left w:type="dxa" w:w="100"/>
+              <w:bottom w:type="dxa" w:w="60"/>
+              <w:right w:type="dxa" w:w="100"/>
+            </w:tcMar>
+          </w:tcPr>
+          <w:p>
+            <w:r>
+              <w:rPr>
+                <w:rFonts w:ascii="Courier New" w:cs="Courier New" w:eastAsia="Courier New" w:hAnsi="Courier New"/>
+                <w:color w:val="1D2433"/>
+                <w:sz w:val="19"/>
+                <w:szCs w:val="19"/>
+              </w:rPr>
+              <w:t xml:space="preserve">ai</w:t>
+            </w:r>
+            <w:r>
+              <w:rPr>
+                <w:b w:val="false"/>
+                <w:bCs w:val="false"/>
+                <w:sz w:val="19"/>
+                <w:szCs w:val="19"/>
+              </w:rPr>
+              <w:t xml:space="preserve"> (dibaca Claude) atau </w:t>
+            </w:r>
+            <w:r>
+              <w:rPr>
+                <w:rFonts w:ascii="Courier New" w:cs="Courier New" w:eastAsia="Courier New" w:hAnsi="Courier New"/>
+                <w:color w:val="1D2433"/>
+                <w:sz w:val="19"/>
+                <w:szCs w:val="19"/>
+              </w:rPr>
+              <w:t xml:space="preserve">aturan</w:t>
+            </w:r>
+            <w:r>
+              <w:rPr>
+                <w:b w:val="false"/>
+                <w:bCs w:val="false"/>
+                <w:sz w:val="19"/>
+                <w:szCs w:val="19"/>
+              </w:rPr>
+              <w:t xml:space="preserve">.</w:t>
+            </w:r>
+          </w:p>
+        </w:tc>
+      </w:tr>
+      <w:tr>
+        <w:tc>
+          <w:tcPr>
+            <w:tcW w:type="dxa" w:w="2347"/>
+            <w:tcBorders>
+              <w:top w:val="single" w:color="C9D1DC" w:sz="4"/>
+              <w:left w:val="single" w:color="C9D1DC" w:sz="4"/>
+              <w:bottom w:val="single" w:color="C9D1DC" w:sz="4"/>
+              <w:right w:val="single" w:color="C9D1DC" w:sz="4"/>
+            </w:tcBorders>
+            <w:tcMar>
+              <w:top w:type="dxa" w:w="60"/>
+              <w:left w:type="dxa" w:w="100"/>
+              <w:bottom w:type="dxa" w:w="60"/>
+              <w:right w:type="dxa" w:w="100"/>
+            </w:tcMar>
+          </w:tcPr>
+          <w:p>
+            <w:r>
+              <w:rPr>
+                <w:rFonts w:ascii="Courier New" w:cs="Courier New" w:eastAsia="Courier New" w:hAnsi="Courier New"/>
+                <w:color w:val="1D2433"/>
+                <w:sz w:val="19"/>
+                <w:szCs w:val="19"/>
+              </w:rPr>
+              <w:t xml:space="preserve">verifikasi</w:t>
+            </w:r>
+          </w:p>
+        </w:tc>
+        <w:tc>
+          <w:tcPr>
+            <w:tcW w:type="dxa" w:w="6679"/>
+            <w:tcBorders>
+              <w:top w:val="single" w:color="C9D1DC" w:sz="4"/>
+              <w:left w:val="single" w:color="C9D1DC" w:sz="4"/>
+              <w:bottom w:val="single" w:color="C9D1DC" w:sz="4"/>
+              <w:right w:val="single" w:color="C9D1DC" w:sz="4"/>
+            </w:tcBorders>
+            <w:tcMar>
+              <w:top w:type="dxa" w:w="60"/>
+              <w:left w:type="dxa" w:w="100"/>
+              <w:bottom w:type="dxa" w:w="60"/>
+              <w:right w:type="dxa" w:w="100"/>
+            </w:tcMar>
+          </w:tcPr>
+          <w:p>
+            <w:r>
+              <w:rPr>
+                <w:b w:val="false"/>
+                <w:bCs w:val="false"/>
+                <w:sz w:val="19"/>
+                <w:szCs w:val="19"/>
+              </w:rPr>
+              <w:t xml:space="preserve">Hasil cek angka ke teks halaman rujukan.</w:t>
+            </w:r>
+          </w:p>
+        </w:tc>
+      </w:tr>
     </w:tbl>
     <w:p>
       <w:pPr>
@@ -12771,6 +14713,24 @@
                 <w:sz w:val="19"/>
                 <w:szCs w:val="19"/>
               </w:rPr>
+              <w:t xml:space="preserve">ai</w:t>
+            </w:r>
+            <w:r>
+              <w:rPr>
+                <w:b w:val="false"/>
+                <w:bCs w:val="false"/>
+                <w:sz w:val="19"/>
+                <w:szCs w:val="19"/>
+              </w:rPr>
+              <w:t xml:space="preserve">, </w:t>
+            </w:r>
+            <w:r>
+              <w:rPr>
+                <w:rFonts w:ascii="Courier New" w:cs="Courier New" w:eastAsia="Courier New" w:hAnsi="Courier New"/>
+                <w:color w:val="1D2433"/>
+                <w:sz w:val="19"/>
+                <w:szCs w:val="19"/>
+              </w:rPr>
               <w:t xml:space="preserve">ambigu</w:t>
             </w:r>
             <w:r>
@@ -13470,7 +15430,274 @@
         <w:pStyle w:val="Heading2"/>
       </w:pPr>
       <w:r>
-        <w:t xml:space="preserve">7.6 Peringatan (peringatan.csv)</w:t>
+        <w:t xml:space="preserve">7.6 Kesimpulan (kesimpulan.csv)</w:t>
+      </w:r>
+    </w:p>
+    <w:tbl>
+      <w:tblPr>
+        <w:tblW w:type="dxa" w:w="9026"/>
+        <w:tblBorders>
+          <w:top w:val="single" w:color="auto" w:sz="4"/>
+          <w:left w:val="single" w:color="auto" w:sz="4"/>
+          <w:bottom w:val="single" w:color="auto" w:sz="4"/>
+          <w:right w:val="single" w:color="auto" w:sz="4"/>
+          <w:insideH w:val="single" w:color="auto" w:sz="4"/>
+          <w:insideV w:val="single" w:color="auto" w:sz="4"/>
+        </w:tblBorders>
+      </w:tblPr>
+      <w:tblGrid>
+        <w:gridCol w:w="2347"/>
+        <w:gridCol w:w="6679"/>
+      </w:tblGrid>
+      <w:tr>
+        <w:trPr>
+          <w:tblHeader/>
+        </w:trPr>
+        <w:tc>
+          <w:tcPr>
+            <w:tcW w:type="dxa" w:w="2347"/>
+            <w:tcBorders>
+              <w:top w:val="single" w:color="C9D1DC" w:sz="4"/>
+              <w:left w:val="single" w:color="C9D1DC" w:sz="4"/>
+              <w:bottom w:val="single" w:color="C9D1DC" w:sz="4"/>
+              <w:right w:val="single" w:color="C9D1DC" w:sz="4"/>
+            </w:tcBorders>
+            <w:shd w:fill="DCE9F2" w:color="auto" w:val="clear"/>
+            <w:tcMar>
+              <w:top w:type="dxa" w:w="60"/>
+              <w:left w:type="dxa" w:w="100"/>
+              <w:bottom w:type="dxa" w:w="60"/>
+              <w:right w:type="dxa" w:w="100"/>
+            </w:tcMar>
+          </w:tcPr>
+          <w:p>
+            <w:r>
+              <w:rPr>
+                <w:b/>
+                <w:bCs/>
+                <w:sz w:val="19"/>
+                <w:szCs w:val="19"/>
+              </w:rPr>
+              <w:t xml:space="preserve">Kolom</w:t>
+            </w:r>
+          </w:p>
+        </w:tc>
+        <w:tc>
+          <w:tcPr>
+            <w:tcW w:type="dxa" w:w="6679"/>
+            <w:tcBorders>
+              <w:top w:val="single" w:color="C9D1DC" w:sz="4"/>
+              <w:left w:val="single" w:color="C9D1DC" w:sz="4"/>
+              <w:bottom w:val="single" w:color="C9D1DC" w:sz="4"/>
+              <w:right w:val="single" w:color="C9D1DC" w:sz="4"/>
+            </w:tcBorders>
+            <w:shd w:fill="DCE9F2" w:color="auto" w:val="clear"/>
+            <w:tcMar>
+              <w:top w:type="dxa" w:w="60"/>
+              <w:left w:type="dxa" w:w="100"/>
+              <w:bottom w:type="dxa" w:w="60"/>
+              <w:right w:type="dxa" w:w="100"/>
+            </w:tcMar>
+          </w:tcPr>
+          <w:p>
+            <w:r>
+              <w:rPr>
+                <w:b/>
+                <w:bCs/>
+                <w:sz w:val="19"/>
+                <w:szCs w:val="19"/>
+              </w:rPr>
+              <w:t xml:space="preserve">Kegunaan</w:t>
+            </w:r>
+          </w:p>
+        </w:tc>
+      </w:tr>
+      <w:tr>
+        <w:tc>
+          <w:tcPr>
+            <w:tcW w:type="dxa" w:w="2347"/>
+            <w:tcBorders>
+              <w:top w:val="single" w:color="C9D1DC" w:sz="4"/>
+              <w:left w:val="single" w:color="C9D1DC" w:sz="4"/>
+              <w:bottom w:val="single" w:color="C9D1DC" w:sz="4"/>
+              <w:right w:val="single" w:color="C9D1DC" w:sz="4"/>
+            </w:tcBorders>
+            <w:tcMar>
+              <w:top w:type="dxa" w:w="60"/>
+              <w:left w:type="dxa" w:w="100"/>
+              <w:bottom w:type="dxa" w:w="60"/>
+              <w:right w:type="dxa" w:w="100"/>
+            </w:tcMar>
+          </w:tcPr>
+          <w:p>
+            <w:r>
+              <w:rPr>
+                <w:rFonts w:ascii="Courier New" w:cs="Courier New" w:eastAsia="Courier New" w:hAnsi="Courier New"/>
+                <w:color w:val="1D2433"/>
+                <w:sz w:val="19"/>
+                <w:szCs w:val="19"/>
+              </w:rPr>
+              <w:t xml:space="preserve">entity_key</w:t>
+            </w:r>
+          </w:p>
+        </w:tc>
+        <w:tc>
+          <w:tcPr>
+            <w:tcW w:type="dxa" w:w="6679"/>
+            <w:tcBorders>
+              <w:top w:val="single" w:color="C9D1DC" w:sz="4"/>
+              <w:left w:val="single" w:color="C9D1DC" w:sz="4"/>
+              <w:bottom w:val="single" w:color="C9D1DC" w:sz="4"/>
+              <w:right w:val="single" w:color="C9D1DC" w:sz="4"/>
+            </w:tcBorders>
+            <w:tcMar>
+              <w:top w:type="dxa" w:w="60"/>
+              <w:left w:type="dxa" w:w="100"/>
+              <w:bottom w:type="dxa" w:w="60"/>
+              <w:right w:type="dxa" w:w="100"/>
+            </w:tcMar>
+          </w:tcPr>
+          <w:p>
+            <w:r>
+              <w:rPr>
+                <w:b w:val="false"/>
+                <w:bCs w:val="false"/>
+                <w:sz w:val="19"/>
+                <w:szCs w:val="19"/>
+              </w:rPr>
+              <w:t xml:space="preserve">Identitas entitas.</w:t>
+            </w:r>
+          </w:p>
+        </w:tc>
+      </w:tr>
+      <w:tr>
+        <w:tc>
+          <w:tcPr>
+            <w:tcW w:type="dxa" w:w="2347"/>
+            <w:tcBorders>
+              <w:top w:val="single" w:color="C9D1DC" w:sz="4"/>
+              <w:left w:val="single" w:color="C9D1DC" w:sz="4"/>
+              <w:bottom w:val="single" w:color="C9D1DC" w:sz="4"/>
+              <w:right w:val="single" w:color="C9D1DC" w:sz="4"/>
+            </w:tcBorders>
+            <w:tcMar>
+              <w:top w:type="dxa" w:w="60"/>
+              <w:left w:type="dxa" w:w="100"/>
+              <w:bottom w:type="dxa" w:w="60"/>
+              <w:right w:type="dxa" w:w="100"/>
+            </w:tcMar>
+          </w:tcPr>
+          <w:p>
+            <w:r>
+              <w:rPr>
+                <w:rFonts w:ascii="Courier New" w:cs="Courier New" w:eastAsia="Courier New" w:hAnsi="Courier New"/>
+                <w:color w:val="1D2433"/>
+                <w:sz w:val="19"/>
+                <w:szCs w:val="19"/>
+              </w:rPr>
+              <w:t xml:space="preserve">kesimpulan</w:t>
+            </w:r>
+          </w:p>
+        </w:tc>
+        <w:tc>
+          <w:tcPr>
+            <w:tcW w:type="dxa" w:w="6679"/>
+            <w:tcBorders>
+              <w:top w:val="single" w:color="C9D1DC" w:sz="4"/>
+              <w:left w:val="single" w:color="C9D1DC" w:sz="4"/>
+              <w:bottom w:val="single" w:color="C9D1DC" w:sz="4"/>
+              <w:right w:val="single" w:color="C9D1DC" w:sz="4"/>
+            </w:tcBorders>
+            <w:tcMar>
+              <w:top w:type="dxa" w:w="60"/>
+              <w:left w:type="dxa" w:w="100"/>
+              <w:bottom w:type="dxa" w:w="60"/>
+              <w:right w:type="dxa" w:w="100"/>
+            </w:tcMar>
+          </w:tcPr>
+          <w:p>
+            <w:r>
+              <w:rPr>
+                <w:b w:val="false"/>
+                <w:bCs w:val="false"/>
+                <w:sz w:val="19"/>
+                <w:szCs w:val="19"/>
+              </w:rPr>
+              <w:t xml:space="preserve">Satu paragraf tentang konsistensi PDF dan Excel entitas itu (dari Claude).</w:t>
+            </w:r>
+          </w:p>
+        </w:tc>
+      </w:tr>
+      <w:tr>
+        <w:tc>
+          <w:tcPr>
+            <w:tcW w:type="dxa" w:w="2347"/>
+            <w:tcBorders>
+              <w:top w:val="single" w:color="C9D1DC" w:sz="4"/>
+              <w:left w:val="single" w:color="C9D1DC" w:sz="4"/>
+              <w:bottom w:val="single" w:color="C9D1DC" w:sz="4"/>
+              <w:right w:val="single" w:color="C9D1DC" w:sz="4"/>
+            </w:tcBorders>
+            <w:tcMar>
+              <w:top w:type="dxa" w:w="60"/>
+              <w:left w:type="dxa" w:w="100"/>
+              <w:bottom w:type="dxa" w:w="60"/>
+              <w:right w:type="dxa" w:w="100"/>
+            </w:tcMar>
+          </w:tcPr>
+          <w:p>
+            <w:r>
+              <w:rPr>
+                <w:rFonts w:ascii="Courier New" w:cs="Courier New" w:eastAsia="Courier New" w:hAnsi="Courier New"/>
+                <w:color w:val="1D2433"/>
+                <w:sz w:val="19"/>
+                <w:szCs w:val="19"/>
+              </w:rPr>
+              <w:t xml:space="preserve">rekomendasi</w:t>
+            </w:r>
+          </w:p>
+        </w:tc>
+        <w:tc>
+          <w:tcPr>
+            <w:tcW w:type="dxa" w:w="6679"/>
+            <w:tcBorders>
+              <w:top w:val="single" w:color="C9D1DC" w:sz="4"/>
+              <w:left w:val="single" w:color="C9D1DC" w:sz="4"/>
+              <w:bottom w:val="single" w:color="C9D1DC" w:sz="4"/>
+              <w:right w:val="single" w:color="C9D1DC" w:sz="4"/>
+            </w:tcBorders>
+            <w:tcMar>
+              <w:top w:type="dxa" w:w="60"/>
+              <w:left w:type="dxa" w:w="100"/>
+              <w:bottom w:type="dxa" w:w="60"/>
+              <w:right w:type="dxa" w:w="100"/>
+            </w:tcMar>
+          </w:tcPr>
+          <w:p>
+            <w:r>
+              <w:rPr>
+                <w:b w:val="false"/>
+                <w:bCs w:val="false"/>
+                <w:sz w:val="19"/>
+                <w:szCs w:val="19"/>
+              </w:rPr>
+              <w:t xml:space="preserve">Daftar tindak lanjut untuk pengawas. Kosong bila AI tidak aktif.</w:t>
+            </w:r>
+          </w:p>
+        </w:tc>
+      </w:tr>
+    </w:tbl>
+    <w:p>
+      <w:pPr>
+        <w:spacing w:after="120"/>
+      </w:pPr>
+    </w:p>
+    <w:p>
+      <w:pPr>
+        <w:pStyle w:val="Heading2"/>
+      </w:pPr>
+      <w:r>
+        <w:t xml:space="preserve">7.7 Peringatan (peringatan.csv)</w:t>
       </w:r>
     </w:p>
     <w:p>
@@ -14080,7 +16307,7 @@
         <w:pStyle w:val="ListParagraph"/>
         <w:numPr>
           <w:ilvl w:val="0"/>
-          <w:numId w:val="5"/>
+          <w:numId w:val="6"/>
         </w:numPr>
         <w:spacing w:after="60"/>
       </w:pPr>
@@ -14093,7 +16320,7 @@
         <w:pStyle w:val="ListParagraph"/>
         <w:numPr>
           <w:ilvl w:val="0"/>
-          <w:numId w:val="5"/>
+          <w:numId w:val="6"/>
         </w:numPr>
         <w:spacing w:after="60"/>
       </w:pPr>
@@ -14106,7 +16333,7 @@
         <w:pStyle w:val="ListParagraph"/>
         <w:numPr>
           <w:ilvl w:val="0"/>
-          <w:numId w:val="5"/>
+          <w:numId w:val="6"/>
         </w:numPr>
         <w:spacing w:after="60"/>
       </w:pPr>
@@ -14128,7 +16355,7 @@
         <w:pStyle w:val="ListParagraph"/>
         <w:numPr>
           <w:ilvl w:val="0"/>
-          <w:numId w:val="5"/>
+          <w:numId w:val="6"/>
         </w:numPr>
         <w:spacing w:after="60"/>
       </w:pPr>
@@ -14921,7 +17148,7 @@
                 <w:sz w:val="19"/>
                 <w:szCs w:val="19"/>
               </w:rPr>
-              <w:t xml:space="preserve">PDF berupa gambar.</w:t>
+              <w:t xml:space="preserve">PDF berupa gambar dan AI tidak aktif.</w:t>
             </w:r>
           </w:p>
         </w:tc>
@@ -14949,7 +17176,206 @@
                 <w:sz w:val="19"/>
                 <w:szCs w:val="19"/>
               </w:rPr>
-              <w:t xml:space="preserve">Lakukan OCR terlebih dahulu, lalu unggah ulang.</w:t>
+              <w:t xml:space="preserve">Aktifkan AI (Claude membaca PDF scan), atau lakukan OCR lalu unggah ulang.</w:t>
+            </w:r>
+          </w:p>
+        </w:tc>
+      </w:tr>
+      <w:tr>
+        <w:tc>
+          <w:tcPr>
+            <w:tcW w:type="dxa" w:w="2347"/>
+            <w:tcBorders>
+              <w:top w:val="single" w:color="C9D1DC" w:sz="4"/>
+              <w:left w:val="single" w:color="C9D1DC" w:sz="4"/>
+              <w:bottom w:val="single" w:color="C9D1DC" w:sz="4"/>
+              <w:right w:val="single" w:color="C9D1DC" w:sz="4"/>
+            </w:tcBorders>
+            <w:tcMar>
+              <w:top w:type="dxa" w:w="60"/>
+              <w:left w:type="dxa" w:w="100"/>
+              <w:bottom w:type="dxa" w:w="60"/>
+              <w:right w:type="dxa" w:w="100"/>
+            </w:tcMar>
+          </w:tcPr>
+          <w:p>
+            <w:r>
+              <w:rPr>
+                <w:b w:val="false"/>
+                <w:bCs w:val="false"/>
+                <w:sz w:val="19"/>
+                <w:szCs w:val="19"/>
+              </w:rPr>
+              <w:t xml:space="preserve">"ekstraksi AI gagal ... memakai aturan"</w:t>
+            </w:r>
+          </w:p>
+        </w:tc>
+        <w:tc>
+          <w:tcPr>
+            <w:tcW w:type="dxa" w:w="3069"/>
+            <w:tcBorders>
+              <w:top w:val="single" w:color="C9D1DC" w:sz="4"/>
+              <w:left w:val="single" w:color="C9D1DC" w:sz="4"/>
+              <w:bottom w:val="single" w:color="C9D1DC" w:sz="4"/>
+              <w:right w:val="single" w:color="C9D1DC" w:sz="4"/>
+            </w:tcBorders>
+            <w:tcMar>
+              <w:top w:type="dxa" w:w="60"/>
+              <w:left w:type="dxa" w:w="100"/>
+              <w:bottom w:type="dxa" w:w="60"/>
+              <w:right w:type="dxa" w:w="100"/>
+            </w:tcMar>
+          </w:tcPr>
+          <w:p>
+            <w:r>
+              <w:rPr>
+                <w:b w:val="false"/>
+                <w:bCs w:val="false"/>
+                <w:sz w:val="19"/>
+                <w:szCs w:val="19"/>
+              </w:rPr>
+              <w:t xml:space="preserve">API key salah, kuota habis, gangguan jaringan, atau PDF terlalu besar.</w:t>
+            </w:r>
+          </w:p>
+        </w:tc>
+        <w:tc>
+          <w:tcPr>
+            <w:tcW w:type="dxa" w:w="3610"/>
+            <w:tcBorders>
+              <w:top w:val="single" w:color="C9D1DC" w:sz="4"/>
+              <w:left w:val="single" w:color="C9D1DC" w:sz="4"/>
+              <w:bottom w:val="single" w:color="C9D1DC" w:sz="4"/>
+              <w:right w:val="single" w:color="C9D1DC" w:sz="4"/>
+            </w:tcBorders>
+            <w:tcMar>
+              <w:top w:type="dxa" w:w="60"/>
+              <w:left w:type="dxa" w:w="100"/>
+              <w:bottom w:type="dxa" w:w="60"/>
+              <w:right w:type="dxa" w:w="100"/>
+            </w:tcMar>
+          </w:tcPr>
+          <w:p>
+            <w:r>
+              <w:rPr>
+                <w:b w:val="false"/>
+                <w:bCs w:val="false"/>
+                <w:sz w:val="19"/>
+                <w:szCs w:val="19"/>
+              </w:rPr>
+              <w:t xml:space="preserve">Periksa secret </w:t>
+            </w:r>
+            <w:r>
+              <w:rPr>
+                <w:rFonts w:ascii="Courier New" w:cs="Courier New" w:eastAsia="Courier New" w:hAnsi="Courier New"/>
+                <w:color w:val="1D2433"/>
+                <w:sz w:val="19"/>
+                <w:szCs w:val="19"/>
+              </w:rPr>
+              <w:t xml:space="preserve">ANTHROPIC_API_KEY</w:t>
+            </w:r>
+            <w:r>
+              <w:rPr>
+                <w:b w:val="false"/>
+                <w:bCs w:val="false"/>
+                <w:sz w:val="19"/>
+                <w:szCs w:val="19"/>
+              </w:rPr>
+              <w:t xml:space="preserve"> dan saldo akun; dokumen tetap diproses dengan aturan.</w:t>
+            </w:r>
+          </w:p>
+        </w:tc>
+      </w:tr>
+      <w:tr>
+        <w:tc>
+          <w:tcPr>
+            <w:tcW w:type="dxa" w:w="2347"/>
+            <w:tcBorders>
+              <w:top w:val="single" w:color="C9D1DC" w:sz="4"/>
+              <w:left w:val="single" w:color="C9D1DC" w:sz="4"/>
+              <w:bottom w:val="single" w:color="C9D1DC" w:sz="4"/>
+              <w:right w:val="single" w:color="C9D1DC" w:sz="4"/>
+            </w:tcBorders>
+            <w:tcMar>
+              <w:top w:type="dxa" w:w="60"/>
+              <w:left w:type="dxa" w:w="100"/>
+              <w:bottom w:type="dxa" w:w="60"/>
+              <w:right w:type="dxa" w:w="100"/>
+            </w:tcMar>
+          </w:tcPr>
+          <w:p>
+            <w:r>
+              <w:rPr>
+                <w:rFonts w:ascii="Courier New" w:cs="Courier New" w:eastAsia="Courier New" w:hAnsi="Courier New"/>
+                <w:color w:val="1D2433"/>
+                <w:sz w:val="19"/>
+                <w:szCs w:val="19"/>
+              </w:rPr>
+              <w:t xml:space="preserve">verifikasi</w:t>
+            </w:r>
+            <w:r>
+              <w:rPr>
+                <w:b w:val="false"/>
+                <w:bCs w:val="false"/>
+                <w:sz w:val="19"/>
+                <w:szCs w:val="19"/>
+              </w:rPr>
+              <w:t xml:space="preserve"> = tidak_ditemukan_di_halaman</w:t>
+            </w:r>
+          </w:p>
+        </w:tc>
+        <w:tc>
+          <w:tcPr>
+            <w:tcW w:type="dxa" w:w="3069"/>
+            <w:tcBorders>
+              <w:top w:val="single" w:color="C9D1DC" w:sz="4"/>
+              <w:left w:val="single" w:color="C9D1DC" w:sz="4"/>
+              <w:bottom w:val="single" w:color="C9D1DC" w:sz="4"/>
+              <w:right w:val="single" w:color="C9D1DC" w:sz="4"/>
+            </w:tcBorders>
+            <w:tcMar>
+              <w:top w:type="dxa" w:w="60"/>
+              <w:left w:type="dxa" w:w="100"/>
+              <w:bottom w:type="dxa" w:w="60"/>
+              <w:right w:type="dxa" w:w="100"/>
+            </w:tcMar>
+          </w:tcPr>
+          <w:p>
+            <w:r>
+              <w:rPr>
+                <w:b w:val="false"/>
+                <w:bCs w:val="false"/>
+                <w:sz w:val="19"/>
+                <w:szCs w:val="19"/>
+              </w:rPr>
+              <w:t xml:space="preserve">Angka dari AI tidak ada di teks halaman yang dirujuk.</w:t>
+            </w:r>
+          </w:p>
+        </w:tc>
+        <w:tc>
+          <w:tcPr>
+            <w:tcW w:type="dxa" w:w="3610"/>
+            <w:tcBorders>
+              <w:top w:val="single" w:color="C9D1DC" w:sz="4"/>
+              <w:left w:val="single" w:color="C9D1DC" w:sz="4"/>
+              <w:bottom w:val="single" w:color="C9D1DC" w:sz="4"/>
+              <w:right w:val="single" w:color="C9D1DC" w:sz="4"/>
+            </w:tcBorders>
+            <w:tcMar>
+              <w:top w:type="dxa" w:w="60"/>
+              <w:left w:type="dxa" w:w="100"/>
+              <w:bottom w:type="dxa" w:w="60"/>
+              <w:right w:type="dxa" w:w="100"/>
+            </w:tcMar>
+          </w:tcPr>
+          <w:p>
+            <w:r>
+              <w:rPr>
+                <w:b w:val="false"/>
+                <w:bCs w:val="false"/>
+                <w:sz w:val="19"/>
+                <w:szCs w:val="19"/>
+              </w:rPr>
+              <w:t xml:space="preserve">Cek manual angka di PDF halaman tersebut sebelum dipakai.</w:t>
             </w:r>
           </w:p>
         </w:tc>
@@ -15199,12 +17625,12 @@
         <w:pStyle w:val="ListParagraph"/>
         <w:numPr>
           <w:ilvl w:val="0"/>
-          <w:numId w:val="5"/>
+          <w:numId w:val="6"/>
         </w:numPr>
         <w:spacing w:after="60"/>
       </w:pPr>
       <w:r>
-        <w:t xml:space="preserve">PDF hasil scan belum didukung (perlu OCR).</w:t>
+        <w:t xml:space="preserve">Tanpa AI: PDF hasil scan belum didukung dan label akun yang terpotong ke dua baris belum terbaca.</w:t>
       </w:r>
     </w:p>
     <w:p>
@@ -15212,12 +17638,12 @@
         <w:pStyle w:val="ListParagraph"/>
         <w:numPr>
           <w:ilvl w:val="0"/>
-          <w:numId w:val="5"/>
+          <w:numId w:val="6"/>
         </w:numPr>
         <w:spacing w:after="60"/>
       </w:pPr>
       <w:r>
-        <w:t xml:space="preserve">Label akun PDF yang terpotong menjadi dua baris belum terbaca.</w:t>
+        <w:t xml:space="preserve">Dengan AI: PDF maksimal sekitar 30 MB / 600 halaman per file; angka PDF scan tidak bisa diverifikasi otomatis.</w:t>
       </w:r>
     </w:p>
     <w:p>
@@ -15225,7 +17651,7 @@
         <w:pStyle w:val="ListParagraph"/>
         <w:numPr>
           <w:ilvl w:val="0"/>
-          <w:numId w:val="5"/>
+          <w:numId w:val="6"/>
         </w:numPr>
         <w:spacing w:after="60"/>
       </w:pPr>
@@ -15509,6 +17935,18 @@
       </w:pPr>
     </w:lvl>
   </w:abstractNum>
+  <w:abstractNum w:abstractNumId="8" w15:restartNumberingAfterBreak="0">
+    <w:multiLevelType w:val="hybridMultilevel"/>
+    <w:lvl w:ilvl="0" w15:tentative="1">
+      <w:start w:val="1"/>
+      <w:numFmt w:val="decimal"/>
+      <w:lvlText w:val="%1."/>
+      <w:lvlJc w:val="left"/>
+      <w:pPr>
+        <w:ind w:left="720" w:hanging="360"/>
+      </w:pPr>
+    </w:lvl>
+  </w:abstractNum>
   <w:num w:numId="1">
     <w:abstractNumId w:val="1"/>
     <w:lvlOverride w:ilvl="0">
@@ -15528,18 +17966,24 @@
     </w:lvlOverride>
   </w:num>
   <w:num w:numId="4">
+    <w:abstractNumId w:val="8"/>
+    <w:lvlOverride w:ilvl="0">
+      <w:startOverride w:val="1"/>
+    </w:lvlOverride>
+  </w:num>
+  <w:num w:numId="5">
     <w:abstractNumId w:val="6"/>
     <w:lvlOverride w:ilvl="0">
       <w:startOverride w:val="1"/>
     </w:lvlOverride>
   </w:num>
-  <w:num w:numId="5">
+  <w:num w:numId="6">
     <w:abstractNumId w:val="2"/>
     <w:lvlOverride w:ilvl="0">
       <w:startOverride w:val="1"/>
     </w:lvlOverride>
   </w:num>
-  <w:num w:numId="6">
+  <w:num w:numId="7">
     <w:abstractNumId w:val="7"/>
     <w:lvlOverride w:ilvl="0">
       <w:startOverride w:val="1"/>

</xml_diff>